<commit_message>
Format CMS tags and variables consistently
</commit_message>
<xml_diff>
--- a/docs/CMS_DOCX_Processor_Team_Guide.docx
+++ b/docs/CMS_DOCX_Processor_Team_Guide.docx
@@ -2470,6 +2470,11 @@
       </w:r>
     </w:p>
     <w:p>
+      <w:r>
+        <w:t>In Full CMS preparation mode, the standalone metadata and section tags shown below are bold. Choice markers @1@ to @4@, the @correct answer@ marker and closing @e@ tags remain in ordinary text, matching the approved reference document.</w:t>
+      </w:r>
+    </w:p>
+    <w:p>
       <w:pPr>
         <w:pStyle w:val="Heading2"/>
         <w:keepNext/>
@@ -3587,7 +3592,7 @@
               <w:rPr>
                 <w:sz w:val="18"/>
               </w:rPr>
-              <w:t>Only variables should be italic, inside or outside an equation. Mixed text runs that cannot be repaired safely are reported.</w:t>
+              <w:t>Only mathematical variables are italic, inside or outside an equation. The check applies across Questions, Answers, Choices and Solutions; surrounding words and numbers remain upright.</w:t>
             </w:r>
           </w:p>
         </w:tc>
@@ -5659,14 +5664,6 @@
         <w:pStyle w:val="ListBullet"/>
       </w:pPr>
       <w:r>
-        <w:t>Mixed italic text where only variables should be italic.</w:t>
-      </w:r>
-    </w:p>
-    <w:p>
-      <w:pPr>
-        <w:pStyle w:val="ListBullet"/>
-      </w:pPr>
-      <w:r>
         <w:t>Mixed Roman and alphabetic labels at the same visible subpart level.</w:t>
       </w:r>
     </w:p>
@@ -5690,6 +5687,7 @@
       <w:pPr>
         <w:pStyle w:val="Heading1"/>
         <w:keepNext/>
+        <w:pageBreakBefore/>
       </w:pPr>
       <w:r>
         <w:t>Troubleshooting</w:t>

</xml_diff>

<commit_message>
Make document structure conventions automatic
</commit_message>
<xml_diff>
--- a/docs/CMS_DOCX_Processor_Team_Guide.docx
+++ b/docs/CMS_DOCX_Processor_Team_Guide.docx
@@ -1383,205 +1383,6 @@
                 <w:sz w:val="18"/>
               </w:rPr>
               <w:t>Fallback when the document has no objective metadata.</w:t>
-            </w:r>
-          </w:p>
-        </w:tc>
-      </w:tr>
-      <w:tr>
-        <w:trPr>
-          <w:cantSplit w:val="true"/>
-        </w:trPr>
-        <w:tc>
-          <w:tcPr>
-            <w:tcW w:type="dxa" w:w="2232"/>
-            <w:vAlign w:val="center"/>
-            <w:tcMar>
-              <w:top w:w="90" w:type="dxa"/>
-              <w:start w:w="110" w:type="dxa"/>
-              <w:bottom w:w="90" w:type="dxa"/>
-              <w:end w:w="110" w:type="dxa"/>
-            </w:tcMar>
-            <w:tcBorders>
-              <w:top w:val="single" w:sz="6" w:color="D9D9D9"/>
-              <w:left w:val="single" w:sz="6" w:color="D9D9D9"/>
-              <w:bottom w:val="single" w:sz="6" w:color="D9D9D9"/>
-              <w:right w:val="single" w:sz="6" w:color="D9D9D9"/>
-              <w:insideH w:val="single" w:sz="6" w:color="D9D9D9"/>
-              <w:insideV w:val="single" w:sz="6" w:color="D9D9D9"/>
-            </w:tcBorders>
-            <w:shd w:fill="F5F8FB"/>
-          </w:tcPr>
-          <w:p>
-            <w:pPr>
-              <w:spacing w:after="0"/>
-            </w:pPr>
-            <w:r>
-              <w:rPr>
-                <w:sz w:val="18"/>
-              </w:rPr>
-              <w:t>First table column header</w:t>
-            </w:r>
-          </w:p>
-        </w:tc>
-        <w:tc>
-          <w:tcPr>
-            <w:tcW w:type="dxa" w:w="1440"/>
-            <w:vAlign w:val="center"/>
-            <w:tcMar>
-              <w:top w:w="90" w:type="dxa"/>
-              <w:start w:w="110" w:type="dxa"/>
-              <w:bottom w:w="90" w:type="dxa"/>
-              <w:end w:w="110" w:type="dxa"/>
-            </w:tcMar>
-            <w:tcBorders>
-              <w:top w:val="single" w:sz="6" w:color="D9D9D9"/>
-              <w:left w:val="single" w:sz="6" w:color="D9D9D9"/>
-              <w:bottom w:val="single" w:sz="6" w:color="D9D9D9"/>
-              <w:right w:val="single" w:sz="6" w:color="D9D9D9"/>
-              <w:insideH w:val="single" w:sz="6" w:color="D9D9D9"/>
-              <w:insideV w:val="single" w:sz="6" w:color="D9D9D9"/>
-            </w:tcBorders>
-            <w:shd w:fill="F5F8FB"/>
-          </w:tcPr>
-          <w:p>
-            <w:pPr>
-              <w:spacing w:after="0"/>
-            </w:pPr>
-            <w:r>
-              <w:rPr>
-                <w:sz w:val="18"/>
-              </w:rPr>
-              <w:t>Not selected</w:t>
-            </w:r>
-          </w:p>
-        </w:tc>
-        <w:tc>
-          <w:tcPr>
-            <w:tcW w:type="dxa" w:w="6264"/>
-            <w:vAlign w:val="center"/>
-            <w:tcMar>
-              <w:top w:w="90" w:type="dxa"/>
-              <w:start w:w="110" w:type="dxa"/>
-              <w:bottom w:w="90" w:type="dxa"/>
-              <w:end w:w="110" w:type="dxa"/>
-            </w:tcMar>
-            <w:tcBorders>
-              <w:top w:val="single" w:sz="6" w:color="D9D9D9"/>
-              <w:left w:val="single" w:sz="6" w:color="D9D9D9"/>
-              <w:bottom w:val="single" w:sz="6" w:color="D9D9D9"/>
-              <w:right w:val="single" w:sz="6" w:color="D9D9D9"/>
-              <w:insideH w:val="single" w:sz="6" w:color="D9D9D9"/>
-              <w:insideV w:val="single" w:sz="6" w:color="D9D9D9"/>
-            </w:tcBorders>
-            <w:shd w:fill="F5F8FB"/>
-          </w:tcPr>
-          <w:p>
-            <w:pPr>
-              <w:spacing w:after="0"/>
-            </w:pPr>
-            <w:r>
-              <w:rPr>
-                <w:sz w:val="18"/>
-              </w:rPr>
-              <w:t>Select only when the first column is also a header column and should be bold.</w:t>
-            </w:r>
-          </w:p>
-        </w:tc>
-      </w:tr>
-      <w:tr>
-        <w:trPr>
-          <w:cantSplit w:val="true"/>
-        </w:trPr>
-        <w:tc>
-          <w:tcPr>
-            <w:tcW w:type="dxa" w:w="2232"/>
-            <w:vAlign w:val="center"/>
-            <w:tcMar>
-              <w:top w:w="90" w:type="dxa"/>
-              <w:start w:w="110" w:type="dxa"/>
-              <w:bottom w:w="90" w:type="dxa"/>
-              <w:end w:w="110" w:type="dxa"/>
-            </w:tcMar>
-            <w:tcBorders>
-              <w:top w:val="single" w:sz="6" w:color="D9D9D9"/>
-              <w:left w:val="single" w:sz="6" w:color="D9D9D9"/>
-              <w:bottom w:val="single" w:sz="6" w:color="D9D9D9"/>
-              <w:right w:val="single" w:sz="6" w:color="D9D9D9"/>
-              <w:insideH w:val="single" w:sz="6" w:color="D9D9D9"/>
-              <w:insideV w:val="single" w:sz="6" w:color="D9D9D9"/>
-            </w:tcBorders>
-          </w:tcPr>
-          <w:p>
-            <w:pPr>
-              <w:spacing w:after="0"/>
-            </w:pPr>
-            <w:r>
-              <w:rPr>
-                <w:sz w:val="18"/>
-              </w:rPr>
-              <w:t>Convert top-level Roman labels</w:t>
-            </w:r>
-          </w:p>
-        </w:tc>
-        <w:tc>
-          <w:tcPr>
-            <w:tcW w:type="dxa" w:w="1440"/>
-            <w:vAlign w:val="center"/>
-            <w:tcMar>
-              <w:top w:w="90" w:type="dxa"/>
-              <w:start w:w="110" w:type="dxa"/>
-              <w:bottom w:w="90" w:type="dxa"/>
-              <w:end w:w="110" w:type="dxa"/>
-            </w:tcMar>
-            <w:tcBorders>
-              <w:top w:val="single" w:sz="6" w:color="D9D9D9"/>
-              <w:left w:val="single" w:sz="6" w:color="D9D9D9"/>
-              <w:bottom w:val="single" w:sz="6" w:color="D9D9D9"/>
-              <w:right w:val="single" w:sz="6" w:color="D9D9D9"/>
-              <w:insideH w:val="single" w:sz="6" w:color="D9D9D9"/>
-              <w:insideV w:val="single" w:sz="6" w:color="D9D9D9"/>
-            </w:tcBorders>
-          </w:tcPr>
-          <w:p>
-            <w:pPr>
-              <w:spacing w:after="0"/>
-            </w:pPr>
-            <w:r>
-              <w:rPr>
-                <w:sz w:val="18"/>
-              </w:rPr>
-              <w:t>Selected</w:t>
-            </w:r>
-          </w:p>
-        </w:tc>
-        <w:tc>
-          <w:tcPr>
-            <w:tcW w:type="dxa" w:w="6264"/>
-            <w:vAlign w:val="center"/>
-            <w:tcMar>
-              <w:top w:w="90" w:type="dxa"/>
-              <w:start w:w="110" w:type="dxa"/>
-              <w:bottom w:w="90" w:type="dxa"/>
-              <w:end w:w="110" w:type="dxa"/>
-            </w:tcMar>
-            <w:tcBorders>
-              <w:top w:val="single" w:sz="6" w:color="D9D9D9"/>
-              <w:left w:val="single" w:sz="6" w:color="D9D9D9"/>
-              <w:bottom w:val="single" w:sz="6" w:color="D9D9D9"/>
-              <w:right w:val="single" w:sz="6" w:color="D9D9D9"/>
-              <w:insideH w:val="single" w:sz="6" w:color="D9D9D9"/>
-              <w:insideV w:val="single" w:sz="6" w:color="D9D9D9"/>
-            </w:tcBorders>
-          </w:tcPr>
-          <w:p>
-            <w:pPr>
-              <w:spacing w:after="0"/>
-            </w:pPr>
-            <w:r>
-              <w:rPr>
-                <w:sz w:val="18"/>
-              </w:rPr>
-              <w:t>Converts unambiguous top-level (i), (ii) labels to (a), (b). Mixed nesting is reported for review.</w:t>
             </w:r>
           </w:p>
         </w:tc>
@@ -3393,7 +3194,7 @@
               <w:rPr>
                 <w:sz w:val="18"/>
               </w:rPr>
-              <w:t>Remove bold only when the entire substantive Question or Solution block is bold. Preserve selective bold emphasis. Bold table header rows and the optional first header column.</w:t>
+              <w:t>Remove bold only when the entire substantive Question or Solution block is bold. Preserve selective bold emphasis. Always bold table header rows and first columns.</w:t>
             </w:r>
           </w:p>
         </w:tc>
@@ -4388,7 +4189,7 @@
               <w:rPr>
                 <w:sz w:val="18"/>
               </w:rPr>
-              <w:t>Use bold header rows and, when selected by the user, a bold first header column.</w:t>
+              <w:t>Always use bold header rows and bold first columns. This is a fixed convention and is not a user setting.</w:t>
             </w:r>
           </w:p>
         </w:tc>

</xml_diff>

<commit_message>
Preserve author table formatting
</commit_message>
<xml_diff>
--- a/docs/CMS_DOCX_Processor_Team_Guide.docx
+++ b/docs/CMS_DOCX_Processor_Team_Guide.docx
@@ -3194,7 +3194,7 @@
               <w:rPr>
                 <w:sz w:val="18"/>
               </w:rPr>
-              <w:t>Remove bold only when the entire substantive Question or Solution block is bold. Preserve selective bold emphasis. Always bold table header rows and first columns.</w:t>
+              <w:t>Remove bold only when the entire substantive Question or Solution block is bold. Preserve selective bold emphasis. Preserve the author's existing table formatting.</w:t>
             </w:r>
           </w:p>
         </w:tc>
@@ -4189,7 +4189,7 @@
               <w:rPr>
                 <w:sz w:val="18"/>
               </w:rPr>
-              <w:t>Always use bold header rows and bold first columns. This is a fixed convention and is not a user setting.</w:t>
+              <w:t>The app preserves existing table formatting. The author must identify and bold any header rows or header columns in the source document because Word does not mark them reliably.</w:t>
             </w:r>
           </w:p>
         </w:tc>

</xml_diff>

<commit_message>
Recognize tagged questions with trailing text
</commit_message>
<xml_diff>
--- a/docs/CMS_DOCX_Processor_Team_Guide.docx
+++ b/docs/CMS_DOCX_Processor_Team_Guide.docx
@@ -26,7 +26,7 @@
         <w:rPr>
           <w:i/>
         </w:rPr>
-        <w:t>Version: 21 September 2026</w:t>
+        <w:t>Version: 22 September 2026</w:t>
         <w:br/>
       </w:r>
       <w:r>
@@ -1509,6 +1509,11 @@
           <w:sz w:val="18"/>
         </w:rPr>
         <w:t>Q4) Challenging</w:t>
+      </w:r>
+    </w:p>
+    <w:p>
+      <w:r>
+        <w:t>A tagged heading with trailing text, such as @Question: 29@ case study, is counted but flagged for manual review. In Full CMS preparation mode, the app changes the heading to @Question: 29@ and preserves case study at the start of the Question block. In Images and Alt Text only mode, it counts and flags the record but preserves the document unchanged.</w:t>
       </w:r>
     </w:p>
     <w:p>
@@ -5486,6 +5491,14 @@
     </w:p>
     <w:p>
       <w:pPr>
+        <w:pStyle w:val="ListBullet"/>
+      </w:pPr>
+      <w:r>
+        <w:t>Text written after the closing @ in a tagged question heading; Full mode preserves it at the start of the Question block and requests a placement check.</w:t>
+      </w:r>
+    </w:p>
+    <w:p>
+      <w:pPr>
         <w:pStyle w:val="Heading1"/>
         <w:keepNext/>
         <w:pageBreakBefore/>

</xml_diff>

<commit_message>
Accept spaces before question tag closure
</commit_message>
<xml_diff>
--- a/docs/CMS_DOCX_Processor_Team_Guide.docx
+++ b/docs/CMS_DOCX_Processor_Team_Guide.docx
@@ -1448,6 +1448,21 @@
           <w:rFonts w:ascii="Courier New" w:hAnsi="Courier New"/>
           <w:sz w:val="18"/>
         </w:rPr>
+        <w:t>@Question:10 @</w:t>
+      </w:r>
+    </w:p>
+    <w:p>
+      <w:pPr>
+        <w:keepLines/>
+        <w:spacing w:after="0" w:before="0"/>
+        <w:ind w:left="403" w:right="259"/>
+        <w:shd w:fill="F2F4F7"/>
+      </w:pPr>
+      <w:r>
+        <w:rPr>
+          <w:rFonts w:ascii="Courier New" w:hAnsi="Courier New"/>
+          <w:sz w:val="18"/>
+        </w:rPr>
         <w:t>Question 1</w:t>
       </w:r>
     </w:p>
@@ -1509,6 +1524,11 @@
           <w:sz w:val="18"/>
         </w:rPr>
         <w:t>Q4) Challenging</w:t>
+      </w:r>
+    </w:p>
+    <w:p>
+      <w:r>
+        <w:t>Spaces before the closing @ in a tagged question heading are accepted and normalised in Full CMS preparation mode.</w:t>
       </w:r>
     </w:p>
     <w:p>

</xml_diff>

<commit_message>
Add safe math processing mode
</commit_message>
<xml_diff>
--- a/docs/CMS_DOCX_Processor_Team_Guide.docx
+++ b/docs/CMS_DOCX_Processor_Team_Guide.docx
@@ -105,7 +105,7 @@
         <w:t xml:space="preserve">2.  </w:t>
       </w:r>
       <w:r>
-        <w:t>Enter the required project and numbering information for a full preparation run, or confirm the fallback project text for an image-only run.</w:t>
+        <w:t>Enter the required project and numbering information for a full preparation run, or confirm the fallback project text for either existing-CMS run.</w:t>
       </w:r>
     </w:p>
     <w:p>
@@ -186,6 +186,14 @@
       </w:pPr>
       <w:r>
         <w:t>Preserves an already tagged document while extracting images and writing image filenames into Word Alt Text in Images and Alt Text only mode.</w:t>
+      </w:r>
+    </w:p>
+    <w:p>
+      <w:pPr>
+        <w:pStyle w:val="ListBullet"/>
+      </w:pPr>
+      <w:r>
+        <w:t>Offers a separate existing-CMS mode that also applies safe mathematical formatting without changing tags, IDs or record structure.</w:t>
       </w:r>
     </w:p>
     <w:p>
@@ -557,6 +565,104 @@
           </w:p>
         </w:tc>
       </w:tr>
+      <w:tr>
+        <w:trPr>
+          <w:cantSplit w:val="true"/>
+        </w:trPr>
+        <w:tc>
+          <w:tcPr>
+            <w:tcW w:type="dxa" w:w="2088"/>
+            <w:vAlign w:val="center"/>
+            <w:tcMar>
+              <w:top w:w="90" w:type="dxa"/>
+              <w:start w:w="110" w:type="dxa"/>
+              <w:bottom w:w="90" w:type="dxa"/>
+              <w:end w:w="110" w:type="dxa"/>
+            </w:tcMar>
+            <w:tcBorders>
+              <w:top w:val="single" w:sz="6" w:color="D9D9D9"/>
+              <w:left w:val="single" w:sz="6" w:color="D9D9D9"/>
+              <w:bottom w:val="single" w:sz="6" w:color="D9D9D9"/>
+              <w:right w:val="single" w:sz="6" w:color="D9D9D9"/>
+              <w:insideH w:val="single" w:sz="6" w:color="D9D9D9"/>
+              <w:insideV w:val="single" w:sz="6" w:color="D9D9D9"/>
+            </w:tcBorders>
+          </w:tcPr>
+          <w:p>
+            <w:pPr>
+              <w:spacing w:after="0"/>
+            </w:pPr>
+            <w:r>
+              <w:rPr>
+                <w:sz w:val="18"/>
+              </w:rPr>
+              <w:t>Images, Alt Text and safe Math formatting</w:t>
+            </w:r>
+          </w:p>
+        </w:tc>
+        <w:tc>
+          <w:tcPr>
+            <w:tcW w:type="dxa" w:w="3240"/>
+            <w:vAlign w:val="center"/>
+            <w:tcMar>
+              <w:top w:w="90" w:type="dxa"/>
+              <w:start w:w="110" w:type="dxa"/>
+              <w:bottom w:w="90" w:type="dxa"/>
+              <w:end w:w="110" w:type="dxa"/>
+            </w:tcMar>
+            <w:tcBorders>
+              <w:top w:val="single" w:sz="6" w:color="D9D9D9"/>
+              <w:left w:val="single" w:sz="6" w:color="D9D9D9"/>
+              <w:bottom w:val="single" w:sz="6" w:color="D9D9D9"/>
+              <w:right w:val="single" w:sz="6" w:color="D9D9D9"/>
+              <w:insideH w:val="single" w:sz="6" w:color="D9D9D9"/>
+              <w:insideV w:val="single" w:sz="6" w:color="D9D9D9"/>
+            </w:tcBorders>
+          </w:tcPr>
+          <w:p>
+            <w:pPr>
+              <w:spacing w:after="0"/>
+            </w:pPr>
+            <w:r>
+              <w:rPr>
+                <w:sz w:val="18"/>
+              </w:rPr>
+              <w:t>The source already has correct CMS tags and IDs, but mathematical formatting also needs checking.</w:t>
+            </w:r>
+          </w:p>
+        </w:tc>
+        <w:tc>
+          <w:tcPr>
+            <w:tcW w:type="dxa" w:w="4608"/>
+            <w:vAlign w:val="center"/>
+            <w:tcMar>
+              <w:top w:w="90" w:type="dxa"/>
+              <w:start w:w="110" w:type="dxa"/>
+              <w:bottom w:w="90" w:type="dxa"/>
+              <w:end w:w="110" w:type="dxa"/>
+            </w:tcMar>
+            <w:tcBorders>
+              <w:top w:val="single" w:sz="6" w:color="D9D9D9"/>
+              <w:left w:val="single" w:sz="6" w:color="D9D9D9"/>
+              <w:bottom w:val="single" w:sz="6" w:color="D9D9D9"/>
+              <w:right w:val="single" w:sz="6" w:color="D9D9D9"/>
+              <w:insideH w:val="single" w:sz="6" w:color="D9D9D9"/>
+              <w:insideV w:val="single" w:sz="6" w:color="D9D9D9"/>
+            </w:tcBorders>
+          </w:tcPr>
+          <w:p>
+            <w:pPr>
+              <w:spacing w:after="0"/>
+            </w:pPr>
+            <w:r>
+              <w:rPr>
+                <w:sz w:val="18"/>
+              </w:rPr>
+              <w:t>Preserves CMS tags, IDs and structure; prepares images and converts only unambiguous mathematical forms to native Word equations.</w:t>
+            </w:r>
+          </w:p>
+        </w:tc>
+      </w:tr>
     </w:tbl>
     <w:p>
       <w:pPr>
@@ -785,7 +891,7 @@
               <w:rPr>
                 <w:sz w:val="18"/>
               </w:rPr>
-              <w:t>Full mode uses the entered value. Image-only mode first reads the project ID from existing Question id tags; the field is only a fallback.</w:t>
+              <w:t>Full mode uses the entered value. Either existing-CMS mode first reads the project ID from existing Question id tags; the field is only a fallback.</w:t>
             </w:r>
           </w:p>
         </w:tc>
@@ -984,7 +1090,7 @@
               <w:rPr>
                 <w:sz w:val="18"/>
               </w:rPr>
-              <w:t>Required in full mode and must be a positive integer. Snippet IDs increase by one. Existing snippet IDs are preserved in image-only mode.</w:t>
+              <w:t>Required in full mode and must be a positive integer. Snippet IDs increase by one. Existing snippet IDs are preserved in both existing-CMS modes.</w:t>
             </w:r>
           </w:p>
         </w:tc>
@@ -1395,7 +1501,56 @@
     </w:p>
     <w:p>
       <w:r>
-        <w:t>Image-only project precedence: if all usable @Question id: …@ tags contain the same project prefix, that prefix controls every generated image filename and the ZIP name. If multiple project prefixes occur, the report lists them and the app uses the fallback field rather than guessing.</w:t>
+        <w:t>Existing-CMS project precedence: if all usable @Question id: …@ tags contain the same project prefix, that prefix controls every generated image filename and the ZIP name. If multiple project prefixes occur, the report lists them and the app uses the fallback field rather than guessing.</w:t>
+      </w:r>
+    </w:p>
+    <w:p>
+      <w:pPr>
+        <w:pStyle w:val="Heading2"/>
+        <w:keepNext/>
+      </w:pPr>
+      <w:r>
+        <w:t>Safe mathematical formatting mode</w:t>
+      </w:r>
+    </w:p>
+    <w:p>
+      <w:pPr>
+        <w:pStyle w:val="ListBullet"/>
+      </w:pPr>
+      <w:r>
+        <w:t>Converts unambiguous ordinary-text assignments such as x = √27 and x = √36 to native Word radical equations.</w:t>
+      </w:r>
+    </w:p>
+    <w:p>
+      <w:pPr>
+        <w:pStyle w:val="ListBullet"/>
+      </w:pPr>
+      <w:r>
+        <w:t>Converts simple fractions such as 1/8 to native stacked fractions with a horizontal bar.</w:t>
+      </w:r>
+    </w:p>
+    <w:p>
+      <w:pPr>
+        <w:pStyle w:val="ListBullet"/>
+      </w:pPr>
+      <w:r>
+        <w:t>Preserves existing native Word equations.</w:t>
+      </w:r>
+    </w:p>
+    <w:p>
+      <w:pPr>
+        <w:pStyle w:val="ListBullet"/>
+      </w:pPr>
+      <w:r>
+        <w:t>Leaves expressions unchanged and reports them when brackets, exponents or radical scope could alter the mathematical meaning.</w:t>
+      </w:r>
+    </w:p>
+    <w:p>
+      <w:pPr>
+        <w:pStyle w:val="ListBullet"/>
+      </w:pPr>
+      <w:r>
+        <w:t>Keeps existing CMS tags, question IDs, snippet IDs and record structure unchanged.</w:t>
       </w:r>
     </w:p>
     <w:p>
@@ -4881,7 +5036,7 @@
     </w:p>
     <w:p>
       <w:r>
-        <w:t>The generated filename is written into the image's Word Alt Text description. The embedded image remains visible in the document. In image-only mode, the project prefix comes from consistent existing Question id tags when available. The image ZIP is named effectiveProjectID_images.zip.</w:t>
+        <w:t>The generated filename is written into the image's Word Alt Text description. The embedded image remains visible in the document. In either existing-CMS mode, the project prefix comes from consistent existing Question id tags when available. The image ZIP is named effectiveProjectID_images.zip.</w:t>
       </w:r>
     </w:p>
     <w:p>
@@ -5146,7 +5301,7 @@
               <w:rPr>
                 <w:sz w:val="18"/>
               </w:rPr>
-              <w:t>Full mode: CMS Verification Ready filename. Image-only mode: Images Alt Text Ready filename. Use this document for verification and Anand's importer after resolving manual findings.</w:t>
+              <w:t>Full mode: CMS Verification Ready. Image-only mode: Images Alt Text Ready. Safe-Math image mode: Images Alt Text Math Ready. Use the document after resolving manual findings.</w:t>
             </w:r>
           </w:p>
         </w:tc>
@@ -5326,7 +5481,7 @@
         <w:t xml:space="preserve">2.  </w:t>
       </w:r>
       <w:r>
-        <w:t>Choose Full CMS preparation for untagged or partly tagged content, or Images and Alt Text only for a document whose CMS structure is already correct.</w:t>
+        <w:t>Choose Full CMS preparation for untagged or partly tagged content, Images and Alt Text only for a document needing no formatting changes, or the safe-Math image mode when mathematical formatting also needs checking.</w:t>
       </w:r>
     </w:p>
     <w:p>
@@ -5337,7 +5492,7 @@
         <w:t xml:space="preserve">3.  </w:t>
       </w:r>
       <w:r>
-        <w:t>Set the required inputs. In full mode, enter the actual project ID and first snippet ID. In image-only mode, existing Question id tags take priority.</w:t>
+        <w:t>Set the required inputs. In full mode, enter the actual project ID and first snippet ID. In either existing-CMS mode, existing Question id tags take priority.</w:t>
       </w:r>
     </w:p>
     <w:p>
@@ -5458,7 +5613,7 @@
         <w:pStyle w:val="ListBullet"/>
       </w:pPr>
       <w:r>
-        <w:t>Multiple project prefixes in existing Question id tags during image-only processing.</w:t>
+        <w:t>Multiple project prefixes in existing Question id tags during either existing-CMS mode.</w:t>
       </w:r>
     </w:p>
     <w:p>
@@ -5743,7 +5898,7 @@
               <w:rPr>
                 <w:sz w:val="18"/>
               </w:rPr>
-              <w:t>Refresh the app. In image-only mode, verify consistent tags such as @Question id: project10436_q1 @. The current version names the ZIP from the effective document project ID.</w:t>
+              <w:t>Refresh the app. In either existing-CMS mode, verify consistent tags such as @Question id: project10436_q1 @. The current version names the ZIP from the effective document project ID.</w:t>
             </w:r>
           </w:p>
         </w:tc>
@@ -6015,7 +6170,7 @@
               <w:rPr>
                 <w:sz w:val="18"/>
               </w:rPr>
-              <w:t>Use Images and Alt Text only to preserve existing tags and IDs. In full mode, review the Replace existing question and snippet IDs setting.</w:t>
+              <w:t>Use either existing-CMS mode to preserve existing tags and IDs. In full mode, review the Replace existing question and snippet IDs setting.</w:t>
             </w:r>
           </w:p>
         </w:tc>

</xml_diff>

<commit_message>
Update team guide for safe-math safeguards
</commit_message>
<xml_diff>
--- a/docs/CMS_DOCX_Processor_Team_Guide.docx
+++ b/docs/CMS_DOCX_Processor_Team_Guide.docx
@@ -26,7 +26,7 @@
         <w:rPr>
           <w:i/>
         </w:rPr>
-        <w:t>Version: 22 September 2026</w:t>
+        <w:t>Version: 22 September 2026 · Processor build: 2026.09.22-safe-math-v2</w:t>
         <w:br/>
       </w:r>
       <w:r>
@@ -94,7 +94,7 @@
         <w:t xml:space="preserve">1.  </w:t>
       </w:r>
       <w:r>
-        <w:t>Open the live app and choose the correct processing mode.</w:t>
+        <w:t>Open the live app, confirm that the displayed processor build is 2026.09.22-safe-math-v2 or later, and choose the correct processing mode.</w:t>
       </w:r>
     </w:p>
     <w:p>
@@ -1534,6 +1534,14 @@
         <w:pStyle w:val="ListBullet"/>
       </w:pPr>
       <w:r>
+        <w:t>Converts a clearly separate fraction such as 1/5 in the list 0.1666…, √2, 1/5, while leaving the other list items unchanged.</w:t>
+      </w:r>
+    </w:p>
+    <w:p>
+      <w:pPr>
+        <w:pStyle w:val="ListBullet"/>
+      </w:pPr>
+      <w:r>
         <w:t>Preserves existing native Word equations.</w:t>
       </w:r>
     </w:p>
@@ -1542,7 +1550,7 @@
         <w:pStyle w:val="ListBullet"/>
       </w:pPr>
       <w:r>
-        <w:t>Leaves expressions unchanged and reports them when brackets, exponents or radical scope could alter the mathematical meaning.</w:t>
+        <w:t>Leaves expressions such as √5/9 and 1/√9 unchanged and reports them when brackets, exponents or radical scope could alter the mathematical meaning.</w:t>
       </w:r>
     </w:p>
     <w:p>
@@ -1551,6 +1559,14 @@
       </w:pPr>
       <w:r>
         <w:t>Keeps existing CMS tags, question IDs, snippet IDs and record structure unchanged.</w:t>
+      </w:r>
+    </w:p>
+    <w:p>
+      <w:pPr>
+        <w:pStyle w:val="ListBullet"/>
+      </w:pPr>
+      <w:r>
+        <w:t>Checks that the interface and processor builds match. If a Streamlit worker is stale, the app reloads the processor or stops instead of producing a mixed-version document.</w:t>
       </w:r>
     </w:p>
     <w:p>
@@ -5637,7 +5653,7 @@
         <w:pStyle w:val="ListBullet"/>
       </w:pPr>
       <w:r>
-        <w:t>Ordinary-text equations that cannot be converted safely, complex slash fractions or mixed-format mathematical runs.</w:t>
+        <w:t>Ordinary-text equations that cannot be converted safely, radical or exponent scope that may change the meaning, complex slash fractions, or mixed-format mathematical runs. One ambiguous expression is reported once rather than as separate fraction and scope findings.</w:t>
       </w:r>
     </w:p>
     <w:p>
@@ -5676,7 +5692,7 @@
       <w:pPr>
         <w:pStyle w:val="Heading1"/>
         <w:keepNext/>
-        <w:pageBreakBefore/>
+        <w:pageBreakBefore w:val="0"/>
       </w:pPr>
       <w:r>
         <w:t>Troubleshooting</w:t>
@@ -6206,6 +6222,142 @@
               <w:rPr>
                 <w:sz w:val="18"/>
               </w:rPr>
+              <w:t>Option 3 behaves like Full CMS mode</w:t>
+            </w:r>
+          </w:p>
+        </w:tc>
+        <w:tc>
+          <w:tcPr>
+            <w:tcW w:type="dxa" w:w="7056"/>
+            <w:vAlign w:val="center"/>
+            <w:tcMar>
+              <w:top w:w="90" w:type="dxa"/>
+              <w:start w:w="110" w:type="dxa"/>
+              <w:bottom w:w="90" w:type="dxa"/>
+              <w:end w:w="110" w:type="dxa"/>
+            </w:tcMar>
+            <w:tcBorders>
+              <w:top w:val="single" w:sz="6" w:color="D9D9D9"/>
+              <w:left w:val="single" w:sz="6" w:color="D9D9D9"/>
+              <w:bottom w:val="single" w:sz="6" w:color="D9D9D9"/>
+              <w:right w:val="single" w:sz="6" w:color="D9D9D9"/>
+              <w:insideH w:val="single" w:sz="6" w:color="D9D9D9"/>
+              <w:insideV w:val="single" w:sz="6" w:color="D9D9D9"/>
+            </w:tcBorders>
+          </w:tcPr>
+          <w:p>
+            <w:pPr>
+              <w:spacing w:after="0"/>
+            </w:pPr>
+            <w:r>
+              <w:rPr>
+                <w:sz w:val="18"/>
+              </w:rPr>
+              <w:t>Do not use that processed DOCX. Refresh the app and confirm the displayed processor build is 2026.09.22-safe-math-v2 or later. The app now reloads a stale processor or stops instead of mixing versions.</w:t>
+            </w:r>
+          </w:p>
+        </w:tc>
+      </w:tr>
+      <w:tr>
+        <w:trPr>
+          <w:cantSplit w:val="true"/>
+        </w:trPr>
+        <w:tc>
+          <w:tcPr>
+            <w:tcW w:type="dxa" w:w="2880"/>
+            <w:vAlign w:val="center"/>
+            <w:tcMar>
+              <w:top w:w="90" w:type="dxa"/>
+              <w:start w:w="110" w:type="dxa"/>
+              <w:bottom w:w="90" w:type="dxa"/>
+              <w:end w:w="110" w:type="dxa"/>
+            </w:tcMar>
+            <w:tcBorders>
+              <w:top w:val="single" w:sz="6" w:color="D9D9D9"/>
+              <w:left w:val="single" w:sz="6" w:color="D9D9D9"/>
+              <w:bottom w:val="single" w:sz="6" w:color="D9D9D9"/>
+              <w:right w:val="single" w:sz="6" w:color="D9D9D9"/>
+              <w:insideH w:val="single" w:sz="6" w:color="D9D9D9"/>
+              <w:insideV w:val="single" w:sz="6" w:color="D9D9D9"/>
+            </w:tcBorders>
+            <w:shd w:fill="F5F8FB"/>
+          </w:tcPr>
+          <w:p>
+            <w:pPr>
+              <w:spacing w:after="0"/>
+            </w:pPr>
+            <w:r>
+              <w:rPr>
+                <w:sz w:val="18"/>
+              </w:rPr>
+              <w:t>Equations or images disappear in option 3</w:t>
+            </w:r>
+          </w:p>
+        </w:tc>
+        <w:tc>
+          <w:tcPr>
+            <w:tcW w:type="dxa" w:w="7056"/>
+            <w:vAlign w:val="center"/>
+            <w:tcMar>
+              <w:top w:w="90" w:type="dxa"/>
+              <w:start w:w="110" w:type="dxa"/>
+              <w:bottom w:w="90" w:type="dxa"/>
+              <w:end w:w="110" w:type="dxa"/>
+            </w:tcMar>
+            <w:tcBorders>
+              <w:top w:val="single" w:sz="6" w:color="D9D9D9"/>
+              <w:left w:val="single" w:sz="6" w:color="D9D9D9"/>
+              <w:bottom w:val="single" w:sz="6" w:color="D9D9D9"/>
+              <w:right w:val="single" w:sz="6" w:color="D9D9D9"/>
+              <w:insideH w:val="single" w:sz="6" w:color="D9D9D9"/>
+              <w:insideV w:val="single" w:sz="6" w:color="D9D9D9"/>
+            </w:tcBorders>
+            <w:shd w:fill="F5F8FB"/>
+          </w:tcPr>
+          <w:p>
+            <w:pPr>
+              <w:spacing w:after="0"/>
+            </w:pPr>
+            <w:r>
+              <w:rPr>
+                <w:sz w:val="18"/>
+              </w:rPr>
+              <w:t>Do not use the output. Retest from the original DOCX with the current processor build. Compare the native-equation and image-occurrence counts in the report; option 3 must preserve existing native equations and every supported image occurrence.</w:t>
+            </w:r>
+          </w:p>
+        </w:tc>
+      </w:tr>
+      <w:tr>
+        <w:trPr>
+          <w:cantSplit w:val="true"/>
+        </w:trPr>
+        <w:tc>
+          <w:tcPr>
+            <w:tcW w:type="dxa" w:w="2880"/>
+            <w:vAlign w:val="center"/>
+            <w:tcMar>
+              <w:top w:w="90" w:type="dxa"/>
+              <w:start w:w="110" w:type="dxa"/>
+              <w:bottom w:w="90" w:type="dxa"/>
+              <w:end w:w="110" w:type="dxa"/>
+            </w:tcMar>
+            <w:tcBorders>
+              <w:top w:val="single" w:sz="6" w:color="D9D9D9"/>
+              <w:left w:val="single" w:sz="6" w:color="D9D9D9"/>
+              <w:bottom w:val="single" w:sz="6" w:color="D9D9D9"/>
+              <w:right w:val="single" w:sz="6" w:color="D9D9D9"/>
+              <w:insideH w:val="single" w:sz="6" w:color="D9D9D9"/>
+              <w:insideV w:val="single" w:sz="6" w:color="D9D9D9"/>
+            </w:tcBorders>
+          </w:tcPr>
+          <w:p>
+            <w:pPr>
+              <w:spacing w:after="0"/>
+            </w:pPr>
+            <w:r>
+              <w:rPr>
+                <w:sz w:val="18"/>
+              </w:rPr>
               <w:t>A document is marked pending review</w:t>
             </w:r>
           </w:p>
@@ -6341,7 +6493,7 @@
     </w:p>
     <w:p>
       <w:r>
-        <w:t>The live app is deployed from the main branch of the GitHub repository. Approved code changes pushed to main trigger an automatic Streamlit rebuild while keeping the same app URL. When behaviour changes, refresh the browser before retesting. Report an issue with the original DOCX, the processed DOCX, the JSON audit report, the project ID used and a short description of the expected result. Do not rely only on a screenshot when the DOCX structure is relevant.</w:t>
+        <w:t>The live app is deployed from the main branch of the GitHub repository. Approved code changes pushed to main trigger an automatic Streamlit rebuild while keeping the same app URL. When behaviour changes, refresh the browser and confirm the displayed processor build before retesting. The JSON audit report also records processor_build_id so the team can identify the exact processor used. Report an issue with the original DOCX, the processed DOCX, the JSON audit report, the project ID used and a short description of the expected result. Do not rely only on a screenshot when the DOCX structure is relevant.</w:t>
       </w:r>
     </w:p>
     <w:sectPr>

</xml_diff>

<commit_message>
Correct mismatched FIB and MCQ types
</commit_message>
<xml_diff>
--- a/docs/CMS_DOCX_Processor_Team_Guide.docx
+++ b/docs/CMS_DOCX_Processor_Team_Guide.docx
@@ -26,7 +26,7 @@
         <w:rPr>
           <w:i/>
         </w:rPr>
-        <w:t>Version: 22 September 2026 · Processor build: 2026.09.22-safe-math-v2</w:t>
+        <w:t>Version: 22 September 2026 · Processor build: 2026.09.22-type-check-v3</w:t>
         <w:br/>
       </w:r>
       <w:r>
@@ -94,7 +94,7 @@
         <w:t xml:space="preserve">1.  </w:t>
       </w:r>
       <w:r>
-        <w:t>Open the live app, confirm that the displayed processor build is 2026.09.22-safe-math-v2 or later, and choose the correct processing mode.</w:t>
+        <w:t>Open the live app, confirm that the displayed processor build is 2026.09.22-type-check-v3 or later, and choose the correct processing mode.</w:t>
       </w:r>
     </w:p>
     <w:p>
@@ -193,7 +193,7 @@
         <w:pStyle w:val="ListBullet"/>
       </w:pPr>
       <w:r>
-        <w:t>Offers a separate existing-CMS mode that also applies safe mathematical formatting without changing tags, IDs or record structure.</w:t>
+        <w:t>Offers a separate existing-CMS mode that applies safe mathematical formatting while preserving IDs and record structure; only a clearly mismatched Type tag may be corrected.</w:t>
       </w:r>
     </w:p>
     <w:p>
@@ -627,7 +627,7 @@
               <w:rPr>
                 <w:sz w:val="18"/>
               </w:rPr>
-              <w:t>The source already has correct CMS tags and IDs, but mathematical formatting also needs checking.</w:t>
+              <w:t>The source already has CMS tags and IDs, but mathematical formatting also needs checking.</w:t>
             </w:r>
           </w:p>
         </w:tc>
@@ -658,7 +658,7 @@
               <w:rPr>
                 <w:sz w:val="18"/>
               </w:rPr>
-              <w:t>Preserves CMS tags, IDs and structure; prepares images and converts only unambiguous mathematical forms to native Word equations.</w:t>
+              <w:t>Preserves IDs and structure; prepares images, converts only unambiguous mathematical forms, and corrects only a clearly mismatched Type tag.</w:t>
             </w:r>
           </w:p>
         </w:tc>
@@ -1558,7 +1558,7 @@
         <w:pStyle w:val="ListBullet"/>
       </w:pPr>
       <w:r>
-        <w:t>Keeps existing CMS tags, question IDs, snippet IDs and record structure unchanged.</w:t>
+        <w:t>Keeps question IDs, snippet IDs and record structure unchanged. Other CMS tags are preserved except when the Type consistency rule safely corrects FIB to MCQ or MCQ to FIB.</w:t>
       </w:r>
     </w:p>
     <w:p>
@@ -1567,6 +1567,55 @@
       </w:pPr>
       <w:r>
         <w:t>Checks that the interface and processor builds match. If a Streamlit worker is stale, the app reloads the processor or stops instead of producing a mixed-version document.</w:t>
+      </w:r>
+    </w:p>
+    <w:p>
+      <w:pPr>
+        <w:pStyle w:val="Heading2"/>
+        <w:keepNext/>
+      </w:pPr>
+      <w:r>
+        <w:t>Question type consistency</w:t>
+      </w:r>
+    </w:p>
+    <w:p>
+      <w:pPr>
+        <w:pStyle w:val="ListBullet"/>
+      </w:pPr>
+      <w:r>
+        <w:t>Treats a record with @Choices:@ and all four markers @1@ to @4@, with no @Answers:@ block, as an MCQ.</w:t>
+      </w:r>
+    </w:p>
+    <w:p>
+      <w:pPr>
+        <w:pStyle w:val="ListBullet"/>
+      </w:pPr>
+      <w:r>
+        <w:t>Treats a record with @Answers:@ and no @Choices:@ block as an FIB.</w:t>
+      </w:r>
+    </w:p>
+    <w:p>
+      <w:pPr>
+        <w:pStyle w:val="ListBullet"/>
+      </w:pPr>
+      <w:r>
+        <w:t>In Full CMS preparation and safe mathematical formatting modes, corrects a mismatched @Type:@ tag and records a Fixed finding for that question.</w:t>
+      </w:r>
+    </w:p>
+    <w:p>
+      <w:pPr>
+        <w:pStyle w:val="ListBullet"/>
+      </w:pPr>
+      <w:r>
+        <w:t>In Images and Alt Text only mode, preserves the mismatched Type tag and records a Manual Review finding.</w:t>
+      </w:r>
+    </w:p>
+    <w:p>
+      <w:pPr>
+        <w:pStyle w:val="ListBullet"/>
+      </w:pPr>
+      <w:r>
+        <w:t>Does not guess when both Answers and Choices occur, when fewer than four choice markers are present, or when a valid Type tag is missing; it reports the record for manual review.</w:t>
       </w:r>
     </w:p>
     <w:p>
@@ -4390,6 +4439,107 @@
           </w:p>
         </w:tc>
       </w:tr>
+      <w:tr>
+        <w:trPr>
+          <w:cantSplit w:val="true"/>
+        </w:trPr>
+        <w:tc>
+          <w:tcPr>
+            <w:tcW w:type="dxa" w:w="792"/>
+            <w:vAlign w:val="center"/>
+            <w:tcMar>
+              <w:top w:w="90" w:type="dxa"/>
+              <w:start w:w="110" w:type="dxa"/>
+              <w:bottom w:w="90" w:type="dxa"/>
+              <w:end w:w="110" w:type="dxa"/>
+            </w:tcMar>
+            <w:tcBorders>
+              <w:top w:val="single" w:sz="6" w:color="D9D9D9"/>
+              <w:left w:val="single" w:sz="6" w:color="D9D9D9"/>
+              <w:bottom w:val="single" w:sz="6" w:color="D9D9D9"/>
+              <w:right w:val="single" w:sz="6" w:color="D9D9D9"/>
+              <w:insideH w:val="single" w:sz="6" w:color="D9D9D9"/>
+              <w:insideV w:val="single" w:sz="6" w:color="D9D9D9"/>
+            </w:tcBorders>
+            <w:shd w:fill="F5F8FB"/>
+          </w:tcPr>
+          <w:p>
+            <w:pPr>
+              <w:spacing w:after="0"/>
+            </w:pPr>
+            <w:r>
+              <w:rPr>
+                <w:sz w:val="18"/>
+              </w:rPr>
+              <w:t>12</w:t>
+            </w:r>
+          </w:p>
+        </w:tc>
+        <w:tc>
+          <w:tcPr>
+            <w:tcW w:type="dxa" w:w="1728"/>
+            <w:vAlign w:val="center"/>
+            <w:tcMar>
+              <w:top w:w="90" w:type="dxa"/>
+              <w:start w:w="110" w:type="dxa"/>
+              <w:bottom w:w="90" w:type="dxa"/>
+              <w:end w:w="110" w:type="dxa"/>
+            </w:tcMar>
+            <w:tcBorders>
+              <w:top w:val="single" w:sz="6" w:color="D9D9D9"/>
+              <w:left w:val="single" w:sz="6" w:color="D9D9D9"/>
+              <w:bottom w:val="single" w:sz="6" w:color="D9D9D9"/>
+              <w:right w:val="single" w:sz="6" w:color="D9D9D9"/>
+              <w:insideH w:val="single" w:sz="6" w:color="D9D9D9"/>
+              <w:insideV w:val="single" w:sz="6" w:color="D9D9D9"/>
+            </w:tcBorders>
+            <w:shd w:fill="F5F8FB"/>
+          </w:tcPr>
+          <w:p>
+            <w:pPr>
+              <w:spacing w:after="0"/>
+            </w:pPr>
+            <w:r>
+              <w:rPr>
+                <w:sz w:val="18"/>
+              </w:rPr>
+              <w:t>Question type</w:t>
+            </w:r>
+          </w:p>
+        </w:tc>
+        <w:tc>
+          <w:tcPr>
+            <w:tcW w:type="dxa" w:w="7416"/>
+            <w:vAlign w:val="center"/>
+            <w:tcMar>
+              <w:top w:w="90" w:type="dxa"/>
+              <w:start w:w="110" w:type="dxa"/>
+              <w:bottom w:w="90" w:type="dxa"/>
+              <w:end w:w="110" w:type="dxa"/>
+            </w:tcMar>
+            <w:tcBorders>
+              <w:top w:val="single" w:sz="6" w:color="D9D9D9"/>
+              <w:left w:val="single" w:sz="6" w:color="D9D9D9"/>
+              <w:bottom w:val="single" w:sz="6" w:color="D9D9D9"/>
+              <w:right w:val="single" w:sz="6" w:color="D9D9D9"/>
+              <w:insideH w:val="single" w:sz="6" w:color="D9D9D9"/>
+              <w:insideV w:val="single" w:sz="6" w:color="D9D9D9"/>
+            </w:tcBorders>
+            <w:shd w:fill="F5F8FB"/>
+          </w:tcPr>
+          <w:p>
+            <w:pPr>
+              <w:spacing w:after="0"/>
+            </w:pPr>
+            <w:r>
+              <w:rPr>
+                <w:sz w:val="18"/>
+              </w:rPr>
+              <w:t>A complete four-choice Choices structure is MCQ; an Answers-only structure is FIB. Correct clear mismatches in Full and safe-Math modes, report them without changing the tag in Images and Alt Text only mode, and flag ambiguous structures.</w:t>
+            </w:r>
+          </w:p>
+        </w:tc>
+      </w:tr>
     </w:tbl>
     <w:p>
       <w:pPr>
@@ -6253,7 +6403,7 @@
               <w:rPr>
                 <w:sz w:val="18"/>
               </w:rPr>
-              <w:t>Do not use that processed DOCX. Refresh the app and confirm the displayed processor build is 2026.09.22-safe-math-v2 or later. The app now reloads a stale processor or stops instead of mixing versions.</w:t>
+              <w:t>Do not use that processed DOCX. Refresh the app and confirm the displayed processor build is 2026.09.22-type-check-v3 or later. The app now reloads a stale processor or stops instead of mixing versions.</w:t>
             </w:r>
           </w:p>
         </w:tc>
@@ -6404,7 +6554,7 @@
       <w:pPr>
         <w:pStyle w:val="Heading1"/>
         <w:keepNext/>
-        <w:pageBreakBefore/>
+        <w:pageBreakBefore w:val="0"/>
       </w:pPr>
       <w:r>
         <w:t>Current limitations and operating controls</w:t>

</xml_diff>

<commit_message>
Handle legacy VML images and detailed headings
</commit_message>
<xml_diff>
--- a/docs/CMS_DOCX_Processor_Team_Guide.docx
+++ b/docs/CMS_DOCX_Processor_Team_Guide.docx
@@ -26,7 +26,7 @@
         <w:rPr>
           <w:i/>
         </w:rPr>
-        <w:t>Version: 22 September 2026 · Processor build: 2026.09.22-type-check-v3</w:t>
+        <w:t>Version: 23 September 2026 · Processor build: 2026.09.23-vml-images-v4</w:t>
         <w:br/>
       </w:r>
       <w:r>
@@ -94,7 +94,7 @@
         <w:t xml:space="preserve">1.  </w:t>
       </w:r>
       <w:r>
-        <w:t>Open the live app, confirm that the displayed processor build is 2026.09.22-type-check-v3 or later, and choose the correct processing mode.</w:t>
+        <w:t>Open the live app, confirm that the displayed processor build is 2026.09.23-vml-images-v4 or later, and choose the correct processing mode.</w:t>
       </w:r>
     </w:p>
     <w:p>
@@ -1698,6 +1698,21 @@
           <w:rFonts w:ascii="Courier New" w:hAnsi="Courier New"/>
           <w:sz w:val="18"/>
         </w:rPr>
+        <w:t>Question 44: Easy, Comprehension</w:t>
+      </w:r>
+    </w:p>
+    <w:p>
+      <w:pPr>
+        <w:keepLines/>
+        <w:spacing w:after="0" w:before="0"/>
+        <w:ind w:left="403" w:right="259"/>
+        <w:shd w:fill="F2F4F7"/>
+      </w:pPr>
+      <w:r>
+        <w:rPr>
+          <w:rFonts w:ascii="Courier New" w:hAnsi="Courier New"/>
+          <w:sz w:val="18"/>
+        </w:rPr>
         <w:t>Q1</w:t>
       </w:r>
     </w:p>
@@ -1749,6 +1764,11 @@
     <w:p>
       <w:r>
         <w:t>Spaces before the closing @ in a tagged question heading are accepted and normalised in Full CMS preparation mode.</w:t>
+      </w:r>
+    </w:p>
+    <w:p>
+      <w:r>
+        <w:t>A plain heading may include both difficulty and objective after the number, separated by a comma, such as Question 44: Easy, Comprehension. Full CMS preparation carries both values into the generated metadata tags.</w:t>
       </w:r>
     </w:p>
     <w:p>
@@ -5227,6 +5247,14 @@
         <w:pStyle w:val="ListBullet"/>
       </w:pPr>
       <w:r>
+        <w:t>The extractor supports both modern DrawingML pictures and legacy Word VML picture containers. A legacy VML shape that does not contain image data is ignored without stopping the document run.</w:t>
+      </w:r>
+    </w:p>
+    <w:p>
+      <w:pPr>
+        <w:pStyle w:val="ListBullet"/>
+      </w:pPr>
+      <w:r>
         <w:t>Transparency is flattened onto white.</w:t>
       </w:r>
     </w:p>
@@ -6403,7 +6431,7 @@
               <w:rPr>
                 <w:sz w:val="18"/>
               </w:rPr>
-              <w:t>Do not use that processed DOCX. Refresh the app and confirm the displayed processor build is 2026.09.22-type-check-v3 or later. The app now reloads a stale processor or stops instead of mixing versions.</w:t>
+              <w:t>Do not use that processed DOCX. Refresh the app and confirm the displayed processor build is 2026.09.23-vml-images-v4 or later. The app now reloads a stale processor or stops instead of mixing versions.</w:t>
             </w:r>
           </w:p>
         </w:tc>
@@ -6440,6 +6468,74 @@
               <w:rPr>
                 <w:sz w:val="18"/>
               </w:rPr>
+              <w:t>XPathEvalError: Undefined namespace prefix</w:t>
+            </w:r>
+          </w:p>
+        </w:tc>
+        <w:tc>
+          <w:tcPr>
+            <w:tcW w:type="dxa" w:w="7056"/>
+            <w:vAlign w:val="center"/>
+            <w:tcMar>
+              <w:top w:w="90" w:type="dxa"/>
+              <w:start w:w="110" w:type="dxa"/>
+              <w:bottom w:w="90" w:type="dxa"/>
+              <w:end w:w="110" w:type="dxa"/>
+            </w:tcMar>
+            <w:tcBorders>
+              <w:top w:val="single" w:sz="6" w:color="D9D9D9"/>
+              <w:left w:val="single" w:sz="6" w:color="D9D9D9"/>
+              <w:bottom w:val="single" w:sz="6" w:color="D9D9D9"/>
+              <w:right w:val="single" w:sz="6" w:color="D9D9D9"/>
+              <w:insideH w:val="single" w:sz="6" w:color="D9D9D9"/>
+              <w:insideV w:val="single" w:sz="6" w:color="D9D9D9"/>
+            </w:tcBorders>
+            <w:shd w:fill="F5F8FB"/>
+          </w:tcPr>
+          <w:p>
+            <w:pPr>
+              <w:spacing w:after="0"/>
+            </w:pPr>
+            <w:r>
+              <w:rPr>
+                <w:sz w:val="18"/>
+              </w:rPr>
+              <w:t>Refresh the app and confirm processor build 2026.09.23-vml-images-v4 or later. Older builds could stop on a legacy Word VML object; the current extractor handles it without aborting the run.</w:t>
+            </w:r>
+          </w:p>
+        </w:tc>
+      </w:tr>
+      <w:tr>
+        <w:trPr>
+          <w:cantSplit w:val="true"/>
+        </w:trPr>
+        <w:tc>
+          <w:tcPr>
+            <w:tcW w:type="dxa" w:w="2880"/>
+            <w:vAlign w:val="center"/>
+            <w:tcMar>
+              <w:top w:w="90" w:type="dxa"/>
+              <w:start w:w="110" w:type="dxa"/>
+              <w:bottom w:w="90" w:type="dxa"/>
+              <w:end w:w="110" w:type="dxa"/>
+            </w:tcMar>
+            <w:tcBorders>
+              <w:top w:val="single" w:sz="6" w:color="D9D9D9"/>
+              <w:left w:val="single" w:sz="6" w:color="D9D9D9"/>
+              <w:bottom w:val="single" w:sz="6" w:color="D9D9D9"/>
+              <w:right w:val="single" w:sz="6" w:color="D9D9D9"/>
+              <w:insideH w:val="single" w:sz="6" w:color="D9D9D9"/>
+              <w:insideV w:val="single" w:sz="6" w:color="D9D9D9"/>
+            </w:tcBorders>
+          </w:tcPr>
+          <w:p>
+            <w:pPr>
+              <w:spacing w:after="0"/>
+            </w:pPr>
+            <w:r>
+              <w:rPr>
+                <w:sz w:val="18"/>
+              </w:rPr>
               <w:t>Equations or images disappear in option 3</w:t>
             </w:r>
           </w:p>
@@ -6462,7 +6558,6 @@
               <w:insideH w:val="single" w:sz="6" w:color="D9D9D9"/>
               <w:insideV w:val="single" w:sz="6" w:color="D9D9D9"/>
             </w:tcBorders>
-            <w:shd w:fill="F5F8FB"/>
           </w:tcPr>
           <w:p>
             <w:pPr>
@@ -6499,6 +6594,7 @@
               <w:insideH w:val="single" w:sz="6" w:color="D9D9D9"/>
               <w:insideV w:val="single" w:sz="6" w:color="D9D9D9"/>
             </w:tcBorders>
+            <w:shd w:fill="F5F8FB"/>
           </w:tcPr>
           <w:p>
             <w:pPr>
@@ -6530,6 +6626,7 @@
               <w:insideH w:val="single" w:sz="6" w:color="D9D9D9"/>
               <w:insideV w:val="single" w:sz="6" w:color="D9D9D9"/>
             </w:tcBorders>
+            <w:shd w:fill="F5F8FB"/>
           </w:tcPr>
           <w:p>
             <w:pPr>

</xml_diff>

<commit_message>
Bump processor build for empty MCQ solutions
</commit_message>
<xml_diff>
--- a/docs/CMS_DOCX_Processor_Team_Guide.docx
+++ b/docs/CMS_DOCX_Processor_Team_Guide.docx
@@ -26,7 +26,7 @@
         <w:rPr>
           <w:i/>
         </w:rPr>
-        <w:t>Version: 23 September 2026 · Processor build: 2026.09.23-vml-images-v4</w:t>
+        <w:t>Version: 23 September 2026 · Processor build: 2026.09.23-empty-solution-v5</w:t>
         <w:br/>
       </w:r>
       <w:r>
@@ -94,7 +94,7 @@
         <w:t xml:space="preserve">1.  </w:t>
       </w:r>
       <w:r>
-        <w:t>Open the live app, confirm that the displayed processor build is 2026.09.23-vml-images-v4 or later, and choose the correct processing mode.</w:t>
+        <w:t>Open the live app, confirm that the displayed processor build is 2026.09.23-empty-solution-v5 or later, and choose the correct processing mode.</w:t>
       </w:r>
     </w:p>
     <w:p>
@@ -6431,7 +6431,7 @@
               <w:rPr>
                 <w:sz w:val="18"/>
               </w:rPr>
-              <w:t>Do not use that processed DOCX. Refresh the app and confirm the displayed processor build is 2026.09.23-vml-images-v4 or later. The app now reloads a stale processor or stops instead of mixing versions.</w:t>
+              <w:t>Do not use that processed DOCX. Refresh the app and confirm the displayed processor build is 2026.09.23-empty-solution-v5 or later. The app now reloads a stale processor or stops instead of mixing versions.</w:t>
             </w:r>
           </w:p>
         </w:tc>
@@ -6500,7 +6500,7 @@
               <w:rPr>
                 <w:sz w:val="18"/>
               </w:rPr>
-              <w:t>Refresh the app and confirm processor build 2026.09.23-vml-images-v4 or later. Older builds could stop on a legacy Word VML object; the current extractor handles it without aborting the run.</w:t>
+              <w:t>Refresh the app and confirm processor build 2026.09.23-empty-solution-v5 or later. Older builds could stop on a legacy Word VML object; the current extractor handles it without aborting the run.</w:t>
             </w:r>
           </w:p>
         </w:tc>

</xml_diff>

<commit_message>
Keep inferred FIB solutions empty
</commit_message>
<xml_diff>
--- a/docs/CMS_DOCX_Processor_Team_Guide.docx
+++ b/docs/CMS_DOCX_Processor_Team_Guide.docx
@@ -26,7 +26,7 @@
         <w:rPr>
           <w:i/>
         </w:rPr>
-        <w:t>Version: 23 September 2026 · Processor build: 2026.09.23-empty-solution-v5</w:t>
+        <w:t>Version: 23 September 2026 · Processor build: 2026.09.23-empty-solution-v6</w:t>
         <w:br/>
       </w:r>
       <w:r>
@@ -94,7 +94,7 @@
         <w:t xml:space="preserve">1.  </w:t>
       </w:r>
       <w:r>
-        <w:t>Open the live app, confirm that the displayed processor build is 2026.09.23-empty-solution-v5 or later, and choose the correct processing mode.</w:t>
+        <w:t>Open the live app, confirm that the displayed processor build is 2026.09.23-empty-solution-v6 or later, and choose the correct processing mode.</w:t>
       </w:r>
     </w:p>
     <w:p>
@@ -2515,7 +2515,7 @@
         <w:pStyle w:val="ListBullet"/>
       </w:pPr>
       <w:r>
-        <w:t>The app creates @Answers:@, writes the value on its own line and creates a simple @Solution:@ statement such as The answer is 50.</w:t>
+        <w:t>The app creates @Answers:@, writes the value on its own line and creates an empty @Solution:@ block. It does not invent solution prose such as The answer is 50.</w:t>
       </w:r>
     </w:p>
     <w:p>
@@ -6431,7 +6431,7 @@
               <w:rPr>
                 <w:sz w:val="18"/>
               </w:rPr>
-              <w:t>Do not use that processed DOCX. Refresh the app and confirm the displayed processor build is 2026.09.23-empty-solution-v5 or later. The app now reloads a stale processor or stops instead of mixing versions.</w:t>
+              <w:t>Do not use that processed DOCX. Refresh the app and confirm the displayed processor build is 2026.09.23-empty-solution-v6 or later. The app now reloads a stale processor or stops instead of mixing versions.</w:t>
             </w:r>
           </w:p>
         </w:tc>
@@ -6500,7 +6500,7 @@
               <w:rPr>
                 <w:sz w:val="18"/>
               </w:rPr>
-              <w:t>Refresh the app and confirm processor build 2026.09.23-empty-solution-v5 or later. Older builds could stop on a legacy Word VML object; the current extractor handles it without aborting the run.</w:t>
+              <w:t>Refresh the app and confirm processor build 2026.09.23-empty-solution-v6 or later. Older builds could stop on a legacy Word VML object; the current extractor handles it without aborting the run.</w:t>
             </w:r>
           </w:p>
         </w:tc>

</xml_diff>

<commit_message>
Recognize punctuated MCQ answer keys
</commit_message>
<xml_diff>
--- a/docs/CMS_DOCX_Processor_Team_Guide.docx
+++ b/docs/CMS_DOCX_Processor_Team_Guide.docx
@@ -26,7 +26,7 @@
         <w:rPr>
           <w:i/>
         </w:rPr>
-        <w:t>Version: 23 September 2026 · Processor build: 2026.09.23-empty-solution-v6</w:t>
+        <w:t>Version: 23 September 2026 · Processor build: 2026.09.23-answer-key-v7</w:t>
         <w:br/>
       </w:r>
       <w:r>
@@ -94,7 +94,7 @@
         <w:t xml:space="preserve">1.  </w:t>
       </w:r>
       <w:r>
-        <w:t>Open the live app, confirm that the displayed processor build is 2026.09.23-empty-solution-v6 or later, and choose the correct processing mode.</w:t>
+        <w:t>Open the live app, confirm that the displayed processor build is 2026.09.23-answer-key-v7 or later, and choose the correct processing mode.</w:t>
       </w:r>
     </w:p>
     <w:p>
@@ -6431,7 +6431,7 @@
               <w:rPr>
                 <w:sz w:val="18"/>
               </w:rPr>
-              <w:t>Do not use that processed DOCX. Refresh the app and confirm the displayed processor build is 2026.09.23-empty-solution-v6 or later. The app now reloads a stale processor or stops instead of mixing versions.</w:t>
+              <w:t>Do not use that processed DOCX. Refresh the app and confirm the displayed processor build is 2026.09.23-answer-key-v7 or later. The app now reloads a stale processor or stops instead of mixing versions.</w:t>
             </w:r>
           </w:p>
         </w:tc>
@@ -6500,7 +6500,7 @@
               <w:rPr>
                 <w:sz w:val="18"/>
               </w:rPr>
-              <w:t>Refresh the app and confirm processor build 2026.09.23-empty-solution-v6 or later. Older builds could stop on a legacy Word VML object; the current extractor handles it without aborting the run.</w:t>
+              <w:t>Refresh the app and confirm processor build 2026.09.23-answer-key-v7 or later. Older builds could stop on a legacy Word VML object; the current extractor handles it without aborting the run.</w:t>
             </w:r>
           </w:p>
         </w:tc>

</xml_diff>

<commit_message>
Update team guide for processor v11
</commit_message>
<xml_diff>
--- a/docs/CMS_DOCX_Processor_Team_Guide.docx
+++ b/docs/CMS_DOCX_Processor_Team_Guide.docx
@@ -26,7 +26,7 @@
         <w:rPr>
           <w:i/>
         </w:rPr>
-        <w:t>Version: 23 September 2026 · Processor build: 2026.09.23-answer-key-v7</w:t>
+        <w:t>Version: 24 September 2026 · Processor build: 2026.09.24-safe-equations-v11</w:t>
         <w:br/>
       </w:r>
       <w:r>
@@ -94,7 +94,7 @@
         <w:t xml:space="preserve">1.  </w:t>
       </w:r>
       <w:r>
-        <w:t>Open the live app, confirm that the displayed processor build is 2026.09.23-answer-key-v7 or later, and choose the correct processing mode.</w:t>
+        <w:t>Open the live app, confirm that the displayed processor build is 2026.09.24-safe-equations-v11, and choose the correct processing mode.</w:t>
       </w:r>
     </w:p>
     <w:p>
@@ -201,7 +201,7 @@
         <w:pStyle w:val="ListBullet"/>
       </w:pPr>
       <w:r>
-        <w:t>Applies only deterministic formatting repairs and reports ambiguous cases for human review.</w:t>
+        <w:t>Applies only deterministic formatting repairs and reports ambiguous cases for human review. It does not invent worked solutions or silently rewrite uncertain mathematics.</w:t>
       </w:r>
     </w:p>
     <w:p>
@@ -240,7 +240,6 @@
       <w:pPr>
         <w:pStyle w:val="Heading1"/>
         <w:keepNext/>
-        <w:pageBreakBefore/>
       </w:pPr>
       <w:r>
         <w:t>Processing modes</w:t>
@@ -1526,7 +1525,7 @@
         <w:pStyle w:val="ListBullet"/>
       </w:pPr>
       <w:r>
-        <w:t>Converts simple fractions such as 1/8 to native stacked fractions with a horizontal bar.</w:t>
+        <w:t>Converts safely recognised explicit expressions and simple fractions to native Word equations with a horizontal fraction bar. The conversion is conservative and limited to structurally simple text runs.</w:t>
       </w:r>
     </w:p>
     <w:p>
@@ -1534,7 +1533,7 @@
         <w:pStyle w:val="ListBullet"/>
       </w:pPr>
       <w:r>
-        <w:t>Converts a clearly separate fraction such as 1/5 in the list 0.1666…, √2, 1/5, while leaving the other list items unchanged.</w:t>
+        <w:t>Preserves expressions whose radical, exponent or fraction scope is uncertain and records a manual-review finding instead of guessing.</w:t>
       </w:r>
     </w:p>
     <w:p>
@@ -1559,6 +1558,14 @@
       </w:pPr>
       <w:r>
         <w:t>Keeps question IDs, snippet IDs and record structure unchanged. Other CMS tags are preserved except when the Type consistency rule safely corrects FIB to MCQ or MCQ to FIB.</w:t>
+      </w:r>
+    </w:p>
+    <w:p>
+      <w:pPr>
+        <w:pStyle w:val="ListBullet"/>
+      </w:pPr>
+      <w:r>
+        <w:t>Preserves author-supplied italics and does not infer variable styling in ordinary prose. Native Word equations use Word's mathematical typography; the author remains responsible for intentional variable, label and unit styling outside equations.</w:t>
       </w:r>
     </w:p>
     <w:p>
@@ -2474,6 +2481,14 @@
         <w:pStyle w:val="ListBullet"/>
       </w:pPr>
       <w:r>
+        <w:t>Answer keys may be written as Answer: b, Answer: b), Answer: (b) or Answer: b. They are treated as MCQ keys when four choices are present.</w:t>
+      </w:r>
+    </w:p>
+    <w:p>
+      <w:pPr>
+        <w:pStyle w:val="ListBullet"/>
+      </w:pPr>
+      <w:r>
         <w:t>Choices may be four separate paragraphs or four labelled lines in one paragraph.</w:t>
       </w:r>
     </w:p>
@@ -2525,6 +2540,642 @@
       <w:r>
         <w:t>Complex or ambiguous answer text remains a manual-review item.</w:t>
       </w:r>
+    </w:p>
+    <w:p>
+      <w:pPr>
+        <w:pStyle w:val="Heading1"/>
+        <w:keepNext/>
+      </w:pPr>
+      <w:r>
+        <w:t>Why earlier features were withdrawn</w:t>
+      </w:r>
+    </w:p>
+    <w:p>
+      <w:r>
+        <w:t>Several behaviours from earlier builds or earlier plans were deliberately narrowed in version 11. The changes reduce the risk of changing mathematical meaning, fabricating content or producing files that look ready when a person still needs to decide something.</w:t>
+      </w:r>
+    </w:p>
+    <w:tbl>
+      <w:tblPr>
+        <w:tblW w:type="auto" w:w="0"/>
+        <w:jc w:val="center"/>
+        <w:tblLayout w:type="fixed"/>
+        <w:tblLook w:firstColumn="1" w:firstRow="1" w:lastColumn="0" w:lastRow="0" w:noHBand="0" w:noVBand="1" w:val="04A0"/>
+      </w:tblPr>
+      <w:tblGrid>
+        <w:gridCol w:w="3331"/>
+        <w:gridCol w:w="3331"/>
+        <w:gridCol w:w="3331"/>
+      </w:tblGrid>
+      <w:tr>
+        <w:trPr>
+          <w:tblHeader w:val="true"/>
+          <w:cantSplit w:val="true"/>
+        </w:trPr>
+        <w:tc>
+          <w:tcPr>
+            <w:tcW w:type="dxa" w:w="2736"/>
+            <w:shd w:fill="1F4E78"/>
+            <w:vAlign w:val="center"/>
+            <w:tcMar>
+              <w:top w:w="90" w:type="dxa"/>
+              <w:start w:w="110" w:type="dxa"/>
+              <w:bottom w:w="90" w:type="dxa"/>
+              <w:end w:w="110" w:type="dxa"/>
+            </w:tcMar>
+            <w:tcBorders>
+              <w:top w:val="single" w:sz="6" w:color="D9D9D9"/>
+              <w:left w:val="single" w:sz="6" w:color="D9D9D9"/>
+              <w:bottom w:val="single" w:sz="6" w:color="D9D9D9"/>
+              <w:right w:val="single" w:sz="6" w:color="D9D9D9"/>
+              <w:insideH w:val="single" w:sz="6" w:color="D9D9D9"/>
+              <w:insideV w:val="single" w:sz="6" w:color="D9D9D9"/>
+            </w:tcBorders>
+          </w:tcPr>
+          <w:p>
+            <w:pPr>
+              <w:jc w:val="center"/>
+            </w:pPr>
+            <w:r>
+              <w:rPr>
+                <w:b/>
+                <w:color w:val="FFFFFF"/>
+                <w:sz w:val="18"/>
+              </w:rPr>
+              <w:t>Earlier behaviour</w:t>
+            </w:r>
+          </w:p>
+        </w:tc>
+        <w:tc>
+          <w:tcPr>
+            <w:tcW w:type="dxa" w:w="3312"/>
+            <w:shd w:fill="1F4E78"/>
+            <w:vAlign w:val="center"/>
+            <w:tcMar>
+              <w:top w:w="90" w:type="dxa"/>
+              <w:start w:w="110" w:type="dxa"/>
+              <w:bottom w:w="90" w:type="dxa"/>
+              <w:end w:w="110" w:type="dxa"/>
+            </w:tcMar>
+            <w:tcBorders>
+              <w:top w:val="single" w:sz="6" w:color="D9D9D9"/>
+              <w:left w:val="single" w:sz="6" w:color="D9D9D9"/>
+              <w:bottom w:val="single" w:sz="6" w:color="D9D9D9"/>
+              <w:right w:val="single" w:sz="6" w:color="D9D9D9"/>
+              <w:insideH w:val="single" w:sz="6" w:color="D9D9D9"/>
+              <w:insideV w:val="single" w:sz="6" w:color="D9D9D9"/>
+            </w:tcBorders>
+          </w:tcPr>
+          <w:p>
+            <w:pPr>
+              <w:jc w:val="center"/>
+            </w:pPr>
+            <w:r>
+              <w:rPr>
+                <w:b/>
+                <w:color w:val="FFFFFF"/>
+                <w:sz w:val="18"/>
+              </w:rPr>
+              <w:t>Current version 11 decision</w:t>
+            </w:r>
+          </w:p>
+        </w:tc>
+        <w:tc>
+          <w:tcPr>
+            <w:tcW w:type="dxa" w:w="3744"/>
+            <w:shd w:fill="1F4E78"/>
+            <w:vAlign w:val="center"/>
+            <w:tcMar>
+              <w:top w:w="90" w:type="dxa"/>
+              <w:start w:w="110" w:type="dxa"/>
+              <w:bottom w:w="90" w:type="dxa"/>
+              <w:end w:w="110" w:type="dxa"/>
+            </w:tcMar>
+            <w:tcBorders>
+              <w:top w:val="single" w:sz="6" w:color="D9D9D9"/>
+              <w:left w:val="single" w:sz="6" w:color="D9D9D9"/>
+              <w:bottom w:val="single" w:sz="6" w:color="D9D9D9"/>
+              <w:right w:val="single" w:sz="6" w:color="D9D9D9"/>
+              <w:insideH w:val="single" w:sz="6" w:color="D9D9D9"/>
+              <w:insideV w:val="single" w:sz="6" w:color="D9D9D9"/>
+            </w:tcBorders>
+          </w:tcPr>
+          <w:p>
+            <w:pPr>
+              <w:jc w:val="center"/>
+            </w:pPr>
+            <w:r>
+              <w:rPr>
+                <w:b/>
+                <w:color w:val="FFFFFF"/>
+                <w:sz w:val="18"/>
+              </w:rPr>
+              <w:t>Reason</w:t>
+            </w:r>
+          </w:p>
+        </w:tc>
+      </w:tr>
+      <w:tr>
+        <w:trPr>
+          <w:cantSplit w:val="true"/>
+        </w:trPr>
+        <w:tc>
+          <w:tcPr>
+            <w:tcW w:type="dxa" w:w="2736"/>
+            <w:vAlign w:val="center"/>
+            <w:tcMar>
+              <w:top w:w="90" w:type="dxa"/>
+              <w:start w:w="110" w:type="dxa"/>
+              <w:bottom w:w="90" w:type="dxa"/>
+              <w:end w:w="110" w:type="dxa"/>
+            </w:tcMar>
+            <w:tcBorders>
+              <w:top w:val="single" w:sz="6" w:color="D9D9D9"/>
+              <w:left w:val="single" w:sz="6" w:color="D9D9D9"/>
+              <w:bottom w:val="single" w:sz="6" w:color="D9D9D9"/>
+              <w:right w:val="single" w:sz="6" w:color="D9D9D9"/>
+              <w:insideH w:val="single" w:sz="6" w:color="D9D9D9"/>
+              <w:insideV w:val="single" w:sz="6" w:color="D9D9D9"/>
+            </w:tcBorders>
+          </w:tcPr>
+          <w:p>
+            <w:pPr>
+              <w:spacing w:after="0"/>
+            </w:pPr>
+            <w:r>
+              <w:rPr>
+                <w:sz w:val="18"/>
+              </w:rPr>
+              <w:t>Invented solution sentences such as The answer is 50.</w:t>
+            </w:r>
+          </w:p>
+        </w:tc>
+        <w:tc>
+          <w:tcPr>
+            <w:tcW w:type="dxa" w:w="3312"/>
+            <w:vAlign w:val="center"/>
+            <w:tcMar>
+              <w:top w:w="90" w:type="dxa"/>
+              <w:start w:w="110" w:type="dxa"/>
+              <w:bottom w:w="90" w:type="dxa"/>
+              <w:end w:w="110" w:type="dxa"/>
+            </w:tcMar>
+            <w:tcBorders>
+              <w:top w:val="single" w:sz="6" w:color="D9D9D9"/>
+              <w:left w:val="single" w:sz="6" w:color="D9D9D9"/>
+              <w:bottom w:val="single" w:sz="6" w:color="D9D9D9"/>
+              <w:right w:val="single" w:sz="6" w:color="D9D9D9"/>
+              <w:insideH w:val="single" w:sz="6" w:color="D9D9D9"/>
+              <w:insideV w:val="single" w:sz="6" w:color="D9D9D9"/>
+            </w:tcBorders>
+          </w:tcPr>
+          <w:p>
+            <w:pPr>
+              <w:spacing w:after="0"/>
+            </w:pPr>
+            <w:r>
+              <w:rPr>
+                <w:sz w:val="18"/>
+              </w:rPr>
+              <w:t>Inferred MCQ and FIB records receive an empty @Solution:@ block unless solution text was supplied in the source.</w:t>
+            </w:r>
+          </w:p>
+        </w:tc>
+        <w:tc>
+          <w:tcPr>
+            <w:tcW w:type="dxa" w:w="3744"/>
+            <w:vAlign w:val="center"/>
+            <w:tcMar>
+              <w:top w:w="90" w:type="dxa"/>
+              <w:start w:w="110" w:type="dxa"/>
+              <w:bottom w:w="90" w:type="dxa"/>
+              <w:end w:w="110" w:type="dxa"/>
+            </w:tcMar>
+            <w:tcBorders>
+              <w:top w:val="single" w:sz="6" w:color="D9D9D9"/>
+              <w:left w:val="single" w:sz="6" w:color="D9D9D9"/>
+              <w:bottom w:val="single" w:sz="6" w:color="D9D9D9"/>
+              <w:right w:val="single" w:sz="6" w:color="D9D9D9"/>
+              <w:insideH w:val="single" w:sz="6" w:color="D9D9D9"/>
+              <w:insideV w:val="single" w:sz="6" w:color="D9D9D9"/>
+            </w:tcBorders>
+          </w:tcPr>
+          <w:p>
+            <w:pPr>
+              <w:spacing w:after="0"/>
+            </w:pPr>
+            <w:r>
+              <w:rPr>
+                <w:sz w:val="18"/>
+              </w:rPr>
+              <w:t>The answer value is not a worked solution; invented prose could be mathematically incomplete or misleading.</w:t>
+            </w:r>
+          </w:p>
+        </w:tc>
+      </w:tr>
+      <w:tr>
+        <w:trPr>
+          <w:cantSplit w:val="true"/>
+        </w:trPr>
+        <w:tc>
+          <w:tcPr>
+            <w:tcW w:type="dxa" w:w="2736"/>
+            <w:vAlign w:val="center"/>
+            <w:tcMar>
+              <w:top w:w="90" w:type="dxa"/>
+              <w:start w:w="110" w:type="dxa"/>
+              <w:bottom w:w="90" w:type="dxa"/>
+              <w:end w:w="110" w:type="dxa"/>
+            </w:tcMar>
+            <w:tcBorders>
+              <w:top w:val="single" w:sz="6" w:color="D9D9D9"/>
+              <w:left w:val="single" w:sz="6" w:color="D9D9D9"/>
+              <w:bottom w:val="single" w:sz="6" w:color="D9D9D9"/>
+              <w:right w:val="single" w:sz="6" w:color="D9D9D9"/>
+              <w:insideH w:val="single" w:sz="6" w:color="D9D9D9"/>
+              <w:insideV w:val="single" w:sz="6" w:color="D9D9D9"/>
+            </w:tcBorders>
+            <w:shd w:fill="F5F8FB"/>
+          </w:tcPr>
+          <w:p>
+            <w:pPr>
+              <w:spacing w:after="0"/>
+            </w:pPr>
+            <w:r>
+              <w:rPr>
+                <w:sz w:val="18"/>
+              </w:rPr>
+              <w:t>Broad automatic equation or italic repairs</w:t>
+            </w:r>
+          </w:p>
+        </w:tc>
+        <w:tc>
+          <w:tcPr>
+            <w:tcW w:type="dxa" w:w="3312"/>
+            <w:vAlign w:val="center"/>
+            <w:tcMar>
+              <w:top w:w="90" w:type="dxa"/>
+              <w:start w:w="110" w:type="dxa"/>
+              <w:bottom w:w="90" w:type="dxa"/>
+              <w:end w:w="110" w:type="dxa"/>
+            </w:tcMar>
+            <w:tcBorders>
+              <w:top w:val="single" w:sz="6" w:color="D9D9D9"/>
+              <w:left w:val="single" w:sz="6" w:color="D9D9D9"/>
+              <w:bottom w:val="single" w:sz="6" w:color="D9D9D9"/>
+              <w:right w:val="single" w:sz="6" w:color="D9D9D9"/>
+              <w:insideH w:val="single" w:sz="6" w:color="D9D9D9"/>
+              <w:insideV w:val="single" w:sz="6" w:color="D9D9D9"/>
+            </w:tcBorders>
+            <w:shd w:fill="F5F8FB"/>
+          </w:tcPr>
+          <w:p>
+            <w:pPr>
+              <w:spacing w:after="0"/>
+            </w:pPr>
+            <w:r>
+              <w:rPr>
+                <w:sz w:val="18"/>
+              </w:rPr>
+              <w:t>Only structurally unambiguous expressions are converted. Native equations and author-supplied italics are preserved; uncertain expressions are reported.</w:t>
+            </w:r>
+          </w:p>
+        </w:tc>
+        <w:tc>
+          <w:tcPr>
+            <w:tcW w:type="dxa" w:w="3744"/>
+            <w:vAlign w:val="center"/>
+            <w:tcMar>
+              <w:top w:w="90" w:type="dxa"/>
+              <w:start w:w="110" w:type="dxa"/>
+              <w:bottom w:w="90" w:type="dxa"/>
+              <w:end w:w="110" w:type="dxa"/>
+            </w:tcMar>
+            <w:tcBorders>
+              <w:top w:val="single" w:sz="6" w:color="D9D9D9"/>
+              <w:left w:val="single" w:sz="6" w:color="D9D9D9"/>
+              <w:bottom w:val="single" w:sz="6" w:color="D9D9D9"/>
+              <w:right w:val="single" w:sz="6" w:color="D9D9D9"/>
+              <w:insideH w:val="single" w:sz="6" w:color="D9D9D9"/>
+              <w:insideV w:val="single" w:sz="6" w:color="D9D9D9"/>
+            </w:tcBorders>
+            <w:shd w:fill="F5F8FB"/>
+          </w:tcPr>
+          <w:p>
+            <w:pPr>
+              <w:spacing w:after="0"/>
+            </w:pPr>
+            <w:r>
+              <w:rPr>
+                <w:sz w:val="18"/>
+              </w:rPr>
+              <w:t>Scope, exponents and variable meaning cannot be inferred reliably from ordinary Word text.</w:t>
+            </w:r>
+          </w:p>
+        </w:tc>
+      </w:tr>
+      <w:tr>
+        <w:trPr>
+          <w:cantSplit w:val="true"/>
+        </w:trPr>
+        <w:tc>
+          <w:tcPr>
+            <w:tcW w:type="dxa" w:w="2736"/>
+            <w:vAlign w:val="center"/>
+            <w:tcMar>
+              <w:top w:w="90" w:type="dxa"/>
+              <w:start w:w="110" w:type="dxa"/>
+              <w:bottom w:w="90" w:type="dxa"/>
+              <w:end w:w="110" w:type="dxa"/>
+            </w:tcMar>
+            <w:tcBorders>
+              <w:top w:val="single" w:sz="6" w:color="D9D9D9"/>
+              <w:left w:val="single" w:sz="6" w:color="D9D9D9"/>
+              <w:bottom w:val="single" w:sz="6" w:color="D9D9D9"/>
+              <w:right w:val="single" w:sz="6" w:color="D9D9D9"/>
+              <w:insideH w:val="single" w:sz="6" w:color="D9D9D9"/>
+              <w:insideV w:val="single" w:sz="6" w:color="D9D9D9"/>
+            </w:tcBorders>
+          </w:tcPr>
+          <w:p>
+            <w:pPr>
+              <w:spacing w:after="0"/>
+            </w:pPr>
+            <w:r>
+              <w:rPr>
+                <w:sz w:val="18"/>
+              </w:rPr>
+              <w:t>Automatic table header detection and bolding</w:t>
+            </w:r>
+          </w:p>
+        </w:tc>
+        <w:tc>
+          <w:tcPr>
+            <w:tcW w:type="dxa" w:w="3312"/>
+            <w:vAlign w:val="center"/>
+            <w:tcMar>
+              <w:top w:w="90" w:type="dxa"/>
+              <w:start w:w="110" w:type="dxa"/>
+              <w:bottom w:w="90" w:type="dxa"/>
+              <w:end w:w="110" w:type="dxa"/>
+            </w:tcMar>
+            <w:tcBorders>
+              <w:top w:val="single" w:sz="6" w:color="D9D9D9"/>
+              <w:left w:val="single" w:sz="6" w:color="D9D9D9"/>
+              <w:bottom w:val="single" w:sz="6" w:color="D9D9D9"/>
+              <w:right w:val="single" w:sz="6" w:color="D9D9D9"/>
+              <w:insideH w:val="single" w:sz="6" w:color="D9D9D9"/>
+              <w:insideV w:val="single" w:sz="6" w:color="D9D9D9"/>
+            </w:tcBorders>
+          </w:tcPr>
+          <w:p>
+            <w:pPr>
+              <w:spacing w:after="0"/>
+            </w:pPr>
+            <w:r>
+              <w:rPr>
+                <w:sz w:val="18"/>
+              </w:rPr>
+              <w:t>Existing table formatting is preserved. Authors identify and bold header rows or columns.</w:t>
+            </w:r>
+          </w:p>
+        </w:tc>
+        <w:tc>
+          <w:tcPr>
+            <w:tcW w:type="dxa" w:w="3744"/>
+            <w:vAlign w:val="center"/>
+            <w:tcMar>
+              <w:top w:w="90" w:type="dxa"/>
+              <w:start w:w="110" w:type="dxa"/>
+              <w:bottom w:w="90" w:type="dxa"/>
+              <w:end w:w="110" w:type="dxa"/>
+            </w:tcMar>
+            <w:tcBorders>
+              <w:top w:val="single" w:sz="6" w:color="D9D9D9"/>
+              <w:left w:val="single" w:sz="6" w:color="D9D9D9"/>
+              <w:bottom w:val="single" w:sz="6" w:color="D9D9D9"/>
+              <w:right w:val="single" w:sz="6" w:color="D9D9D9"/>
+              <w:insideH w:val="single" w:sz="6" w:color="D9D9D9"/>
+              <w:insideV w:val="single" w:sz="6" w:color="D9D9D9"/>
+            </w:tcBorders>
+          </w:tcPr>
+          <w:p>
+            <w:pPr>
+              <w:spacing w:after="0"/>
+            </w:pPr>
+            <w:r>
+              <w:rPr>
+                <w:sz w:val="18"/>
+              </w:rPr>
+              <w:t>DOCX does not reliably express which row or column is a semantic header.</w:t>
+            </w:r>
+          </w:p>
+        </w:tc>
+      </w:tr>
+      <w:tr>
+        <w:trPr>
+          <w:cantSplit w:val="true"/>
+        </w:trPr>
+        <w:tc>
+          <w:tcPr>
+            <w:tcW w:type="dxa" w:w="2736"/>
+            <w:vAlign w:val="center"/>
+            <w:tcMar>
+              <w:top w:w="90" w:type="dxa"/>
+              <w:start w:w="110" w:type="dxa"/>
+              <w:bottom w:w="90" w:type="dxa"/>
+              <w:end w:w="110" w:type="dxa"/>
+            </w:tcMar>
+            <w:tcBorders>
+              <w:top w:val="single" w:sz="6" w:color="D9D9D9"/>
+              <w:left w:val="single" w:sz="6" w:color="D9D9D9"/>
+              <w:bottom w:val="single" w:sz="6" w:color="D9D9D9"/>
+              <w:right w:val="single" w:sz="6" w:color="D9D9D9"/>
+              <w:insideH w:val="single" w:sz="6" w:color="D9D9D9"/>
+              <w:insideV w:val="single" w:sz="6" w:color="D9D9D9"/>
+            </w:tcBorders>
+            <w:shd w:fill="F5F8FB"/>
+          </w:tcPr>
+          <w:p>
+            <w:pPr>
+              <w:spacing w:after="0"/>
+            </w:pPr>
+            <w:r>
+              <w:rPr>
+                <w:sz w:val="18"/>
+              </w:rPr>
+              <w:t>Automatic upload of questions or images to CMS</w:t>
+            </w:r>
+          </w:p>
+        </w:tc>
+        <w:tc>
+          <w:tcPr>
+            <w:tcW w:type="dxa" w:w="3312"/>
+            <w:vAlign w:val="center"/>
+            <w:tcMar>
+              <w:top w:w="90" w:type="dxa"/>
+              <w:start w:w="110" w:type="dxa"/>
+              <w:bottom w:w="90" w:type="dxa"/>
+              <w:end w:w="110" w:type="dxa"/>
+            </w:tcMar>
+            <w:tcBorders>
+              <w:top w:val="single" w:sz="6" w:color="D9D9D9"/>
+              <w:left w:val="single" w:sz="6" w:color="D9D9D9"/>
+              <w:bottom w:val="single" w:sz="6" w:color="D9D9D9"/>
+              <w:right w:val="single" w:sz="6" w:color="D9D9D9"/>
+              <w:insideH w:val="single" w:sz="6" w:color="D9D9D9"/>
+              <w:insideV w:val="single" w:sz="6" w:color="D9D9D9"/>
+            </w:tcBorders>
+            <w:shd w:fill="F5F8FB"/>
+          </w:tcPr>
+          <w:p>
+            <w:pPr>
+              <w:spacing w:after="0"/>
+            </w:pPr>
+            <w:r>
+              <w:rPr>
+                <w:sz w:val="18"/>
+              </w:rPr>
+              <w:t>The app provides the tagged DOCX, GIF ZIP and audit report. CMS upload remains manual or is handled by Anand's separate tool.</w:t>
+            </w:r>
+          </w:p>
+        </w:tc>
+        <w:tc>
+          <w:tcPr>
+            <w:tcW w:type="dxa" w:w="3744"/>
+            <w:vAlign w:val="center"/>
+            <w:tcMar>
+              <w:top w:w="90" w:type="dxa"/>
+              <w:start w:w="110" w:type="dxa"/>
+              <w:bottom w:w="90" w:type="dxa"/>
+              <w:end w:w="110" w:type="dxa"/>
+            </w:tcMar>
+            <w:tcBorders>
+              <w:top w:val="single" w:sz="6" w:color="D9D9D9"/>
+              <w:left w:val="single" w:sz="6" w:color="D9D9D9"/>
+              <w:bottom w:val="single" w:sz="6" w:color="D9D9D9"/>
+              <w:right w:val="single" w:sz="6" w:color="D9D9D9"/>
+              <w:insideH w:val="single" w:sz="6" w:color="D9D9D9"/>
+              <w:insideV w:val="single" w:sz="6" w:color="D9D9D9"/>
+            </w:tcBorders>
+            <w:shd w:fill="F5F8FB"/>
+          </w:tcPr>
+          <w:p>
+            <w:pPr>
+              <w:spacing w:after="0"/>
+            </w:pPr>
+            <w:r>
+              <w:rPr>
+                <w:sz w:val="18"/>
+              </w:rPr>
+              <w:t>The processor must remain separate from CMS credentials, publishing decisions and verification.</w:t>
+            </w:r>
+          </w:p>
+        </w:tc>
+      </w:tr>
+      <w:tr>
+        <w:trPr>
+          <w:cantSplit w:val="true"/>
+        </w:trPr>
+        <w:tc>
+          <w:tcPr>
+            <w:tcW w:type="dxa" w:w="2736"/>
+            <w:vAlign w:val="center"/>
+            <w:tcMar>
+              <w:top w:w="90" w:type="dxa"/>
+              <w:start w:w="110" w:type="dxa"/>
+              <w:bottom w:w="90" w:type="dxa"/>
+              <w:end w:w="110" w:type="dxa"/>
+            </w:tcMar>
+            <w:tcBorders>
+              <w:top w:val="single" w:sz="6" w:color="D9D9D9"/>
+              <w:left w:val="single" w:sz="6" w:color="D9D9D9"/>
+              <w:bottom w:val="single" w:sz="6" w:color="D9D9D9"/>
+              <w:right w:val="single" w:sz="6" w:color="D9D9D9"/>
+              <w:insideH w:val="single" w:sz="6" w:color="D9D9D9"/>
+              <w:insideV w:val="single" w:sz="6" w:color="D9D9D9"/>
+            </w:tcBorders>
+          </w:tcPr>
+          <w:p>
+            <w:pPr>
+              <w:spacing w:after="0"/>
+            </w:pPr>
+            <w:r>
+              <w:rPr>
+                <w:sz w:val="18"/>
+              </w:rPr>
+              <w:t>Image reuse across separate uploads</w:t>
+            </w:r>
+          </w:p>
+        </w:tc>
+        <w:tc>
+          <w:tcPr>
+            <w:tcW w:type="dxa" w:w="3312"/>
+            <w:vAlign w:val="center"/>
+            <w:tcMar>
+              <w:top w:w="90" w:type="dxa"/>
+              <w:start w:w="110" w:type="dxa"/>
+              <w:bottom w:w="90" w:type="dxa"/>
+              <w:end w:w="110" w:type="dxa"/>
+            </w:tcMar>
+            <w:tcBorders>
+              <w:top w:val="single" w:sz="6" w:color="D9D9D9"/>
+              <w:left w:val="single" w:sz="6" w:color="D9D9D9"/>
+              <w:bottom w:val="single" w:sz="6" w:color="D9D9D9"/>
+              <w:right w:val="single" w:sz="6" w:color="D9D9D9"/>
+              <w:insideH w:val="single" w:sz="6" w:color="D9D9D9"/>
+              <w:insideV w:val="single" w:sz="6" w:color="D9D9D9"/>
+            </w:tcBorders>
+          </w:tcPr>
+          <w:p>
+            <w:pPr>
+              <w:spacing w:after="0"/>
+            </w:pPr>
+            <w:r>
+              <w:rPr>
+                <w:sz w:val="18"/>
+              </w:rPr>
+              <w:t>Exact duplicate images are reused only within the current uploaded DOCX and within the correct CMS asset bucket.</w:t>
+            </w:r>
+          </w:p>
+        </w:tc>
+        <w:tc>
+          <w:tcPr>
+            <w:tcW w:type="dxa" w:w="3744"/>
+            <w:vAlign w:val="center"/>
+            <w:tcMar>
+              <w:top w:w="90" w:type="dxa"/>
+              <w:start w:w="110" w:type="dxa"/>
+              <w:bottom w:w="90" w:type="dxa"/>
+              <w:end w:w="110" w:type="dxa"/>
+            </w:tcMar>
+            <w:tcBorders>
+              <w:top w:val="single" w:sz="6" w:color="D9D9D9"/>
+              <w:left w:val="single" w:sz="6" w:color="D9D9D9"/>
+              <w:bottom w:val="single" w:sz="6" w:color="D9D9D9"/>
+              <w:right w:val="single" w:sz="6" w:color="D9D9D9"/>
+              <w:insideH w:val="single" w:sz="6" w:color="D9D9D9"/>
+              <w:insideV w:val="single" w:sz="6" w:color="D9D9D9"/>
+            </w:tcBorders>
+          </w:tcPr>
+          <w:p>
+            <w:pPr>
+              <w:spacing w:after="0"/>
+            </w:pPr>
+            <w:r>
+              <w:rPr>
+                <w:sz w:val="18"/>
+              </w:rPr>
+              <w:t>Cross-document reuse requires a persistent, trusted project image catalogue; near-duplicates must not be merged automatically.</w:t>
+            </w:r>
+          </w:p>
+        </w:tc>
+      </w:tr>
+    </w:tbl>
+    <w:p>
+      <w:pPr>
+        <w:spacing w:after="40"/>
+      </w:pPr>
     </w:p>
     <w:p>
       <w:pPr>
@@ -2756,7 +3407,7 @@
           <w:rFonts w:ascii="Courier New" w:hAnsi="Courier New"/>
           <w:sz w:val="18"/>
         </w:rPr>
-        <w:t>The answer is 50.</w:t>
+        <w:t>@e@</w:t>
       </w:r>
     </w:p>
     <w:p>
@@ -2771,7 +3422,7 @@
           <w:rFonts w:ascii="Courier New" w:hAnsi="Courier New"/>
           <w:sz w:val="18"/>
         </w:rPr>
-        <w:t>@e@</w:t>
+        <w:t xml:space="preserve"> </w:t>
       </w:r>
     </w:p>
     <w:p>
@@ -3560,7 +4211,7 @@
               <w:rPr>
                 <w:sz w:val="18"/>
               </w:rPr>
-              <w:t>Use Word Insert &gt; Equation for mathematical expressions. Numbers are upright; only variables are italic. Ordinary-text equations and possible equation screenshots are reported when conversion is unsafe.</w:t>
+              <w:t>Preserve existing native equations. Convert only explicit, structurally unambiguous ordinary-text expressions; report equation screenshots and uncertain scope for manual review.</w:t>
             </w:r>
           </w:p>
         </w:tc>
@@ -3658,7 +4309,7 @@
               <w:rPr>
                 <w:sz w:val="18"/>
               </w:rPr>
-              <w:t>Only mathematical variables are italic, inside or outside an equation. The check applies across Questions, Answers, Choices and Solutions; surrounding words and numbers remain upright.</w:t>
+              <w:t>Preserve author-supplied italics. Native Word equations use mathematical typography; the app does not infer or rewrite ordinary-text variable styling.</w:t>
             </w:r>
           </w:p>
         </w:tc>
@@ -4056,7 +4707,7 @@
               <w:rPr>
                 <w:sz w:val="18"/>
               </w:rPr>
-              <w:t>Do not leave fractions as slash text such as 3/10. Convert safely recognisable cases to stacked native Word fractions; report complex cases.</w:t>
+              <w:t>Convert safely recognisable simple fractions to stacked native Word fractions; preserve and report complex or ambiguous slash fractions.</w:t>
             </w:r>
           </w:p>
         </w:tc>
@@ -6431,7 +7082,7 @@
               <w:rPr>
                 <w:sz w:val="18"/>
               </w:rPr>
-              <w:t>Do not use that processed DOCX. Refresh the app and confirm the displayed processor build is 2026.09.23-answer-key-v7 or later. The app now reloads a stale processor or stops instead of mixing versions.</w:t>
+              <w:t>Do not use that processed DOCX. Refresh the app and confirm the displayed processor build is 2026.09.24-safe-equations-v11. The app now reloads a stale processor or stops instead of mixing versions.</w:t>
             </w:r>
           </w:p>
         </w:tc>
@@ -6500,7 +7151,7 @@
               <w:rPr>
                 <w:sz w:val="18"/>
               </w:rPr>
-              <w:t>Refresh the app and confirm processor build 2026.09.23-answer-key-v7 or later. Older builds could stop on a legacy Word VML object; the current extractor handles it without aborting the run.</w:t>
+              <w:t>Refresh the app and confirm processor build 2026.09.24-safe-equations-v11. The current extractor handles legacy Word VML objects without aborting the run.</w:t>
             </w:r>
           </w:p>
         </w:tc>

</xml_diff>

<commit_message>
Add safe authoring rules for version 12
</commit_message>
<xml_diff>
--- a/docs/CMS_DOCX_Processor_Team_Guide.docx
+++ b/docs/CMS_DOCX_Processor_Team_Guide.docx
@@ -26,7 +26,7 @@
         <w:rPr>
           <w:i/>
         </w:rPr>
-        <w:t>Version: 24 September 2026 · Processor build: 2026.09.24-safe-equations-v11</w:t>
+        <w:t>Version: 25 September 2026 · Processor build: 2026.09.25-authoring-rules-v12</w:t>
         <w:br/>
       </w:r>
       <w:r>
@@ -94,7 +94,7 @@
         <w:t xml:space="preserve">1.  </w:t>
       </w:r>
       <w:r>
-        <w:t>Open the live app, confirm that the displayed processor build is 2026.09.24-safe-equations-v11, and choose the correct processing mode.</w:t>
+        <w:t>Open the live app, confirm that the displayed processor build is 2026.09.25-authoring-rules-v12, and choose the correct processing mode.</w:t>
       </w:r>
     </w:p>
     <w:p>
@@ -1525,7 +1525,23 @@
         <w:pStyle w:val="ListBullet"/>
       </w:pPr>
       <w:r>
-        <w:t>Converts safely recognised explicit expressions and simple fractions to native Word equations with a horizontal fraction bar. The conversion is conservative and limited to structurally simple text runs.</w:t>
+        <w:t>Converts safely recognised explicit expressions and simple fractions to native Word equations with a horizontal fraction bar, including a plain fraction followed by a space and a unit word.</w:t>
+      </w:r>
+    </w:p>
+    <w:p>
+      <w:pPr>
+        <w:pStyle w:val="ListBullet"/>
+      </w:pPr>
+      <w:r>
+        <w:t>Uses a space after a slash fraction as the end of its denominator. Write 1/2 r for one-half times r, (1/2)r when explicit grouping is preferred, and 1/(2r) when 2r is the complete denominator. The unspaced form 1/2r remains ambiguous and is reported.</w:t>
+      </w:r>
+    </w:p>
+    <w:p>
+      <w:pPr>
+        <w:pStyle w:val="ListBullet"/>
+      </w:pPr>
+      <w:r>
+        <w:t>Converts self-contained radicals such as √144, √25 and √(r² + d²) even when they occur inside a sentence, while preserving the surrounding text and formatting.</w:t>
       </w:r>
     </w:p>
     <w:p>
@@ -1565,7 +1581,15 @@
         <w:pStyle w:val="ListBullet"/>
       </w:pPr>
       <w:r>
-        <w:t>Preserves author-supplied italics and does not infer variable styling in ordinary prose. Native Word equations use Word's mathematical typography; the author remains responsible for intentional variable, label and unit styling outside equations.</w:t>
+        <w:t>Preserves author-supplied italics and italicises high-confidence variables or geometry labels identified through equations or explicit cues such as point A, line BC, radius r and let x. Articles, option labels and recognised measurement units are protected; uncertain labels remain unchanged and are reported.</w:t>
+      </w:r>
+    </w:p>
+    <w:p>
+      <w:pPr>
+        <w:pStyle w:val="ListBullet"/>
+      </w:pPr>
+      <w:r>
+        <w:t>Converts ₹ immediately before a numeric amount to Rs followed by one space, for example ₹1,250.50 becomes Rs 1,250.50.</w:t>
       </w:r>
     </w:p>
     <w:p>
@@ -2481,7 +2505,15 @@
         <w:pStyle w:val="ListBullet"/>
       </w:pPr>
       <w:r>
-        <w:t>Answer keys may be written as Answer: b, Answer: b), Answer: (b) or Answer: b. They are treated as MCQ keys when four choices are present.</w:t>
+        <w:t>Type: and Question type: are accepted. Answer: and Correct answer: are accepted as answer-key labels.</w:t>
+      </w:r>
+    </w:p>
+    <w:p>
+      <w:pPr>
+        <w:pStyle w:val="ListBullet"/>
+      </w:pPr>
+      <w:r>
+        <w:t>MCQ keys may be written as b, b), (b), 2 or b) choice text. When choice text is supplied, it must agree with the selected choice; conflicts are preserved and reported.</w:t>
       </w:r>
     </w:p>
     <w:p>
@@ -2552,7 +2584,7 @@
     </w:p>
     <w:p>
       <w:r>
-        <w:t>Several behaviours from earlier builds or earlier plans were deliberately narrowed in version 11. The changes reduce the risk of changing mathematical meaning, fabricating content or producing files that look ready when a person still needs to decide something.</w:t>
+        <w:t>Several behaviours from earlier builds or earlier plans remain deliberately limited in version 12. The limits reduce the risk of changing mathematical meaning, fabricating content or producing files that look ready when a person still needs to decide something.</w:t>
       </w:r>
     </w:p>
     <w:tbl>
@@ -2636,7 +2668,7 @@
                 <w:color w:val="FFFFFF"/>
                 <w:sz w:val="18"/>
               </w:rPr>
-              <w:t>Current version 11 decision</w:t>
+              <w:t>Current version 12 decision</w:t>
             </w:r>
           </w:p>
         </w:tc>
@@ -2837,7 +2869,7 @@
               <w:rPr>
                 <w:sz w:val="18"/>
               </w:rPr>
-              <w:t>Only structurally unambiguous expressions are converted. Native equations and author-supplied italics are preserved; uncertain expressions are reported.</w:t>
+              <w:t>Only structurally unambiguous expressions are converted. Italics are added only for high-confidence variables and geometry labels; uncertain cases are preserved and reported.</w:t>
             </w:r>
           </w:p>
         </w:tc>
@@ -2869,7 +2901,7 @@
               <w:rPr>
                 <w:sz w:val="18"/>
               </w:rPr>
-              <w:t>Scope, exponents and variable meaning cannot be inferred reliably from ordinary Word text.</w:t>
+              <w:t>Scope, exponents, units and ordinary uses of letters cannot be inferred reliably from every Word sentence.</w:t>
             </w:r>
           </w:p>
         </w:tc>
@@ -4309,7 +4341,7 @@
               <w:rPr>
                 <w:sz w:val="18"/>
               </w:rPr>
-              <w:t>Preserve author-supplied italics. Native Word equations use mathematical typography; the app does not infer or rewrite ordinary-text variable styling.</w:t>
+              <w:t>Preserve author-supplied italics. Italicise high-confidence variables and geometry labels from equations or explicit cues. Protect recognised units, articles and option or part labels; report uncertain cases.</w:t>
             </w:r>
           </w:p>
         </w:tc>
@@ -4410,7 +4442,7 @@
               <w:rPr>
                 <w:sz w:val="18"/>
               </w:rPr>
-              <w:t>Remove empty equation objects, blank exponent/subscript templates and repeated spaces.</w:t>
+              <w:t>Remove empty equation objects and blank exponent/subscript templates. Replace non-breaking spaces, collapse repeated spaces across adjacent runs and remove spaces before punctuation while preserving run formatting.</w:t>
             </w:r>
           </w:p>
         </w:tc>
@@ -4707,7 +4739,7 @@
               <w:rPr>
                 <w:sz w:val="18"/>
               </w:rPr>
-              <w:t>Convert safely recognisable simple fractions to stacked native Word fractions; preserve and report complex or ambiguous slash fractions.</w:t>
+              <w:t>A space ends a slash denominator. Convert safe fractions to stacked Word fractions; require brackets for multi-term denominators and preserve ambiguous unspaced forms such as 1/2r.</w:t>
             </w:r>
           </w:p>
         </w:tc>
@@ -5207,6 +5239,104 @@
                 <w:sz w:val="18"/>
               </w:rPr>
               <w:t>A complete four-choice Choices structure is MCQ; an Answers-only structure is FIB. Correct clear mismatches in Full and safe-Math modes, report them without changing the tag in Images and Alt Text only mode, and flag ambiguous structures.</w:t>
+            </w:r>
+          </w:p>
+        </w:tc>
+      </w:tr>
+      <w:tr>
+        <w:trPr>
+          <w:cantSplit w:val="true"/>
+        </w:trPr>
+        <w:tc>
+          <w:tcPr>
+            <w:tcW w:type="dxa" w:w="792"/>
+            <w:vAlign w:val="center"/>
+            <w:tcMar>
+              <w:top w:w="90" w:type="dxa"/>
+              <w:start w:w="110" w:type="dxa"/>
+              <w:bottom w:w="90" w:type="dxa"/>
+              <w:end w:w="110" w:type="dxa"/>
+            </w:tcMar>
+            <w:tcBorders>
+              <w:top w:val="single" w:sz="6" w:color="D9D9D9"/>
+              <w:left w:val="single" w:sz="6" w:color="D9D9D9"/>
+              <w:bottom w:val="single" w:sz="6" w:color="D9D9D9"/>
+              <w:right w:val="single" w:sz="6" w:color="D9D9D9"/>
+              <w:insideH w:val="single" w:sz="6" w:color="D9D9D9"/>
+              <w:insideV w:val="single" w:sz="6" w:color="D9D9D9"/>
+            </w:tcBorders>
+          </w:tcPr>
+          <w:p>
+            <w:pPr>
+              <w:spacing w:after="0"/>
+            </w:pPr>
+            <w:r>
+              <w:rPr>
+                <w:sz w:val="18"/>
+              </w:rPr>
+              <w:t>13</w:t>
+            </w:r>
+          </w:p>
+        </w:tc>
+        <w:tc>
+          <w:tcPr>
+            <w:tcW w:type="dxa" w:w="1728"/>
+            <w:vAlign w:val="center"/>
+            <w:tcMar>
+              <w:top w:w="90" w:type="dxa"/>
+              <w:start w:w="110" w:type="dxa"/>
+              <w:bottom w:w="90" w:type="dxa"/>
+              <w:end w:w="110" w:type="dxa"/>
+            </w:tcMar>
+            <w:tcBorders>
+              <w:top w:val="single" w:sz="6" w:color="D9D9D9"/>
+              <w:left w:val="single" w:sz="6" w:color="D9D9D9"/>
+              <w:bottom w:val="single" w:sz="6" w:color="D9D9D9"/>
+              <w:right w:val="single" w:sz="6" w:color="D9D9D9"/>
+              <w:insideH w:val="single" w:sz="6" w:color="D9D9D9"/>
+              <w:insideV w:val="single" w:sz="6" w:color="D9D9D9"/>
+            </w:tcBorders>
+          </w:tcPr>
+          <w:p>
+            <w:pPr>
+              <w:spacing w:after="0"/>
+            </w:pPr>
+            <w:r>
+              <w:rPr>
+                <w:sz w:val="18"/>
+              </w:rPr>
+              <w:t>Currency</w:t>
+            </w:r>
+          </w:p>
+        </w:tc>
+        <w:tc>
+          <w:tcPr>
+            <w:tcW w:type="dxa" w:w="7416"/>
+            <w:vAlign w:val="center"/>
+            <w:tcMar>
+              <w:top w:w="90" w:type="dxa"/>
+              <w:start w:w="110" w:type="dxa"/>
+              <w:bottom w:w="90" w:type="dxa"/>
+              <w:end w:w="110" w:type="dxa"/>
+            </w:tcMar>
+            <w:tcBorders>
+              <w:top w:val="single" w:sz="6" w:color="D9D9D9"/>
+              <w:left w:val="single" w:sz="6" w:color="D9D9D9"/>
+              <w:bottom w:val="single" w:sz="6" w:color="D9D9D9"/>
+              <w:right w:val="single" w:sz="6" w:color="D9D9D9"/>
+              <w:insideH w:val="single" w:sz="6" w:color="D9D9D9"/>
+              <w:insideV w:val="single" w:sz="6" w:color="D9D9D9"/>
+            </w:tcBorders>
+          </w:tcPr>
+          <w:p>
+            <w:pPr>
+              <w:spacing w:after="0"/>
+            </w:pPr>
+            <w:r>
+              <w:rPr>
+                <w:sz w:val="18"/>
+              </w:rPr>
+              <w:t>Convert ₹ followed by a numeric amount to Rs followed by one space. Currency inside an image is not changed.</w:t>
             </w:r>
           </w:p>
         </w:tc>
@@ -6490,6 +6620,22 @@
         <w:pStyle w:val="ListBullet"/>
       </w:pPr>
       <w:r>
+        <w:t>A Correct answer entry whose letter or number does not agree with its supplied choice text.</w:t>
+      </w:r>
+    </w:p>
+    <w:p>
+      <w:pPr>
+        <w:pStyle w:val="ListBullet"/>
+      </w:pPr>
+      <w:r>
+        <w:t>A possible variable or geometry label that cannot be distinguished safely from an article, ordinary label or unit.</w:t>
+      </w:r>
+    </w:p>
+    <w:p>
+      <w:pPr>
+        <w:pStyle w:val="ListBullet"/>
+      </w:pPr>
+      <w:r>
         <w:t>Mixed Roman and alphabetic labels at the same visible subpart level.</w:t>
       </w:r>
     </w:p>
@@ -7082,7 +7228,7 @@
               <w:rPr>
                 <w:sz w:val="18"/>
               </w:rPr>
-              <w:t>Do not use that processed DOCX. Refresh the app and confirm the displayed processor build is 2026.09.24-safe-equations-v11. The app now reloads a stale processor or stops instead of mixing versions.</w:t>
+              <w:t>Do not use that processed DOCX. Refresh the app and confirm the displayed processor build is 2026.09.25-authoring-rules-v12. The app reloads a stale processor or stops instead of mixing versions.</w:t>
             </w:r>
           </w:p>
         </w:tc>
@@ -7151,7 +7297,7 @@
               <w:rPr>
                 <w:sz w:val="18"/>
               </w:rPr>
-              <w:t>Refresh the app and confirm processor build 2026.09.24-safe-equations-v11. The current extractor handles legacy Word VML objects without aborting the run.</w:t>
+              <w:t>Refresh the app and confirm processor build 2026.09.25-authoring-rules-v12. The current extractor handles legacy Word VML objects without aborting the run.</w:t>
             </w:r>
           </w:p>
         </w:tc>

</xml_diff>

<commit_message>
Accept flexible mapping spreadsheets
</commit_message>
<xml_diff>
--- a/docs/CMS_DOCX_Processor_Team_Guide.docx
+++ b/docs/CMS_DOCX_Processor_Team_Guide.docx
@@ -15,7 +15,7 @@
         <w:pStyle w:val="Subtitle"/>
       </w:pPr>
       <w:r>
-        <w:t>Team authoring, processing and CMS mapping guide  |  Version 14.7  |  25 September 2026</w:t>
+        <w:t>Team authoring, processing and CMS mapping guide  |  Version 14.7  |  26 September 2026</w:t>
       </w:r>
     </w:p>
     <w:p>
@@ -4210,8 +4210,9 @@
         <w:tblLook w:firstColumn="1" w:firstRow="1" w:lastColumn="0" w:lastRow="0" w:noHBand="0" w:noVBand="1" w:val="04A0"/>
       </w:tblPr>
       <w:tblGrid>
-        <w:gridCol w:w="5083"/>
-        <w:gridCol w:w="5083"/>
+        <w:gridCol w:w="3389"/>
+        <w:gridCol w:w="3389"/>
+        <w:gridCol w:w="3389"/>
       </w:tblGrid>
       <w:tr>
         <w:trPr>
@@ -4220,7 +4221,7 @@
         </w:trPr>
         <w:tc>
           <w:tcPr>
-            <w:tcW w:type="dxa" w:w="2304"/>
+            <w:tcW w:type="dxa" w:w="2232"/>
             <w:shd w:fill="17365D"/>
             <w:tcMar>
               <w:top w:w="100" w:type="dxa"/>
@@ -4240,13 +4241,13 @@
                 <w:color w:val="FFFFFF"/>
                 <w:sz w:val="18"/>
               </w:rPr>
-              <w:t>Required column</w:t>
+              <w:t>Accepted layout</w:t>
             </w:r>
           </w:p>
         </w:tc>
         <w:tc>
           <w:tcPr>
-            <w:tcW w:type="dxa" w:w="8064"/>
+            <w:tcW w:type="dxa" w:w="4176"/>
             <w:shd w:fill="17365D"/>
             <w:tcMar>
               <w:top w:w="100" w:type="dxa"/>
@@ -4266,7 +4267,33 @@
                 <w:color w:val="FFFFFF"/>
                 <w:sz w:val="18"/>
               </w:rPr>
-              <w:t>Rule</w:t>
+              <w:t>Columns</w:t>
+            </w:r>
+          </w:p>
+        </w:tc>
+        <w:tc>
+          <w:tcPr>
+            <w:tcW w:type="dxa" w:w="3960"/>
+            <w:shd w:fill="17365D"/>
+            <w:tcMar>
+              <w:top w:w="100" w:type="dxa"/>
+              <w:start w:w="110" w:type="dxa"/>
+              <w:bottom w:w="100" w:type="dxa"/>
+              <w:end w:w="110" w:type="dxa"/>
+            </w:tcMar>
+            <w:vAlign w:val="center"/>
+          </w:tcPr>
+          <w:p>
+            <w:pPr>
+              <w:jc w:val="center"/>
+            </w:pPr>
+            <w:r>
+              <w:rPr>
+                <w:b/>
+                <w:color w:val="FFFFFF"/>
+                <w:sz w:val="18"/>
+              </w:rPr>
+              <w:t>How it is processed</w:t>
             </w:r>
           </w:p>
         </w:tc>
@@ -4277,7 +4304,7 @@
         </w:trPr>
         <w:tc>
           <w:tcPr>
-            <w:tcW w:type="dxa" w:w="2304"/>
+            <w:tcW w:type="dxa" w:w="2232"/>
             <w:tcMar>
               <w:top w:w="100" w:type="dxa"/>
               <w:start w:w="110" w:type="dxa"/>
@@ -4294,13 +4321,13 @@
               <w:rPr>
                 <w:sz w:val="17"/>
               </w:rPr>
-              <w:t>Question</w:t>
+              <w:t>Long format</w:t>
             </w:r>
           </w:p>
         </w:tc>
         <w:tc>
           <w:tcPr>
-            <w:tcW w:type="dxa" w:w="8064"/>
+            <w:tcW w:type="dxa" w:w="4176"/>
             <w:tcMar>
               <w:top w:w="100" w:type="dxa"/>
               <w:start w:w="110" w:type="dxa"/>
@@ -4317,7 +4344,30 @@
               <w:rPr>
                 <w:sz w:val="17"/>
               </w:rPr>
-              <w:t>The author-facing question reference. It is retained for review.</w:t>
+              <w:t>Question or Project; optional Snippet ID; Mapping Type; Path</w:t>
+            </w:r>
+          </w:p>
+        </w:tc>
+        <w:tc>
+          <w:tcPr>
+            <w:tcW w:type="dxa" w:w="3960"/>
+            <w:tcMar>
+              <w:top w:w="100" w:type="dxa"/>
+              <w:start w:w="110" w:type="dxa"/>
+              <w:bottom w:w="100" w:type="dxa"/>
+              <w:end w:w="110" w:type="dxa"/>
+            </w:tcMar>
+            <w:vAlign w:val="center"/>
+          </w:tcPr>
+          <w:p>
+            <w:pPr>
+              <w:spacing w:after="0"/>
+            </w:pPr>
+            <w:r>
+              <w:rPr>
+                <w:sz w:val="17"/>
+              </w:rPr>
+              <w:t>One mapping path per row. Mapping Type must be Curriculum or Taxonomy.</w:t>
             </w:r>
           </w:p>
         </w:tc>
@@ -4328,7 +4378,7 @@
         </w:trPr>
         <w:tc>
           <w:tcPr>
-            <w:tcW w:type="dxa" w:w="2304"/>
+            <w:tcW w:type="dxa" w:w="2232"/>
             <w:shd w:fill="EEF5FB"/>
             <w:tcMar>
               <w:top w:w="100" w:type="dxa"/>
@@ -4346,13 +4396,13 @@
               <w:rPr>
                 <w:sz w:val="17"/>
               </w:rPr>
-              <w:t>Snippet ID</w:t>
+              <w:t>Wide team format</w:t>
             </w:r>
           </w:p>
         </w:tc>
         <w:tc>
           <w:tcPr>
-            <w:tcW w:type="dxa" w:w="8064"/>
+            <w:tcW w:type="dxa" w:w="4176"/>
             <w:shd w:fill="EEF5FB"/>
             <w:tcMar>
               <w:top w:w="100" w:type="dxa"/>
@@ -4370,69 +4420,13 @@
               <w:rPr>
                 <w:sz w:val="17"/>
               </w:rPr>
-              <w:t>Must be a positive numeric CMS snippet that already exists.</w:t>
-            </w:r>
-          </w:p>
-        </w:tc>
-      </w:tr>
-      <w:tr>
-        <w:trPr>
-          <w:cantSplit w:val="true"/>
-        </w:trPr>
-        <w:tc>
-          <w:tcPr>
-            <w:tcW w:type="dxa" w:w="2304"/>
-            <w:tcMar>
-              <w:top w:w="100" w:type="dxa"/>
-              <w:start w:w="110" w:type="dxa"/>
-              <w:bottom w:w="100" w:type="dxa"/>
-              <w:end w:w="110" w:type="dxa"/>
-            </w:tcMar>
-            <w:vAlign w:val="center"/>
-          </w:tcPr>
-          <w:p>
-            <w:pPr>
-              <w:spacing w:after="0"/>
-            </w:pPr>
-            <w:r>
-              <w:rPr>
-                <w:sz w:val="17"/>
-              </w:rPr>
-              <w:t>Mapping Type</w:t>
+              <w:t>Project with qno or Project; optional Snippet ID; Taxonomy; Curriculum</w:t>
             </w:r>
           </w:p>
         </w:tc>
         <w:tc>
           <w:tcPr>
-            <w:tcW w:type="dxa" w:w="8064"/>
-            <w:tcMar>
-              <w:top w:w="100" w:type="dxa"/>
-              <w:start w:w="110" w:type="dxa"/>
-              <w:bottom w:w="100" w:type="dxa"/>
-              <w:end w:w="110" w:type="dxa"/>
-            </w:tcMar>
-            <w:vAlign w:val="center"/>
-          </w:tcPr>
-          <w:p>
-            <w:pPr>
-              <w:spacing w:after="0"/>
-            </w:pPr>
-            <w:r>
-              <w:rPr>
-                <w:sz w:val="17"/>
-              </w:rPr>
-              <w:t>Must be Curriculum or Taxonomy.</w:t>
-            </w:r>
-          </w:p>
-        </w:tc>
-      </w:tr>
-      <w:tr>
-        <w:trPr>
-          <w:cantSplit w:val="true"/>
-        </w:trPr>
-        <w:tc>
-          <w:tcPr>
-            <w:tcW w:type="dxa" w:w="2304"/>
+            <w:tcW w:type="dxa" w:w="3960"/>
             <w:shd w:fill="EEF5FB"/>
             <w:tcMar>
               <w:top w:w="100" w:type="dxa"/>
@@ -4450,13 +4444,92 @@
               <w:rPr>
                 <w:sz w:val="17"/>
               </w:rPr>
-              <w:t>Path</w:t>
+              <w:t>Each non-empty Taxonomy/Curriculum cell is expanded into mapping rows.</w:t>
+            </w:r>
+          </w:p>
+        </w:tc>
+      </w:tr>
+      <w:tr>
+        <w:trPr>
+          <w:cantSplit w:val="true"/>
+        </w:trPr>
+        <w:tc>
+          <w:tcPr>
+            <w:tcW w:type="dxa" w:w="2232"/>
+            <w:tcMar>
+              <w:top w:w="100" w:type="dxa"/>
+              <w:start w:w="110" w:type="dxa"/>
+              <w:bottom w:w="100" w:type="dxa"/>
+              <w:end w:w="110" w:type="dxa"/>
+            </w:tcMar>
+            <w:vAlign w:val="center"/>
+          </w:tcPr>
+          <w:p>
+            <w:pPr>
+              <w:spacing w:after="0"/>
+            </w:pPr>
+            <w:r>
+              <w:rPr>
+                <w:sz w:val="17"/>
+              </w:rPr>
+              <w:t>Wide snippet-only format</w:t>
             </w:r>
           </w:p>
         </w:tc>
         <w:tc>
           <w:tcPr>
-            <w:tcW w:type="dxa" w:w="8064"/>
+            <w:tcW w:type="dxa" w:w="4176"/>
+            <w:tcMar>
+              <w:top w:w="100" w:type="dxa"/>
+              <w:start w:w="110" w:type="dxa"/>
+              <w:bottom w:w="100" w:type="dxa"/>
+              <w:end w:w="110" w:type="dxa"/>
+            </w:tcMar>
+            <w:vAlign w:val="center"/>
+          </w:tcPr>
+          <w:p>
+            <w:pPr>
+              <w:spacing w:after="0"/>
+            </w:pPr>
+            <w:r>
+              <w:rPr>
+                <w:sz w:val="17"/>
+              </w:rPr>
+              <w:t>Snippet ID; Taxonomy; Curriculum</w:t>
+            </w:r>
+          </w:p>
+        </w:tc>
+        <w:tc>
+          <w:tcPr>
+            <w:tcW w:type="dxa" w:w="3960"/>
+            <w:tcMar>
+              <w:top w:w="100" w:type="dxa"/>
+              <w:start w:w="110" w:type="dxa"/>
+              <w:bottom w:w="100" w:type="dxa"/>
+              <w:end w:w="110" w:type="dxa"/>
+            </w:tcMar>
+            <w:vAlign w:val="center"/>
+          </w:tcPr>
+          <w:p>
+            <w:pPr>
+              <w:spacing w:after="0"/>
+            </w:pPr>
+            <w:r>
+              <w:rPr>
+                <w:sz w:val="17"/>
+              </w:rPr>
+              <w:t>The supplied snippet identifies the CMS question.</w:t>
+            </w:r>
+          </w:p>
+        </w:tc>
+      </w:tr>
+      <w:tr>
+        <w:trPr>
+          <w:cantSplit w:val="true"/>
+        </w:trPr>
+        <w:tc>
+          <w:tcPr>
+            <w:tcW w:type="dxa" w:w="2232"/>
             <w:shd w:fill="EEF5FB"/>
             <w:tcMar>
               <w:top w:w="100" w:type="dxa"/>
@@ -4474,7 +4547,55 @@
               <w:rPr>
                 <w:sz w:val="17"/>
               </w:rPr>
-              <w:t>One exact CMS path per row.</w:t>
+              <w:t>Wide project-only format</w:t>
+            </w:r>
+          </w:p>
+        </w:tc>
+        <w:tc>
+          <w:tcPr>
+            <w:tcW w:type="dxa" w:w="4176"/>
+            <w:shd w:fill="EEF5FB"/>
+            <w:tcMar>
+              <w:top w:w="100" w:type="dxa"/>
+              <w:start w:w="110" w:type="dxa"/>
+              <w:bottom w:w="100" w:type="dxa"/>
+              <w:end w:w="110" w:type="dxa"/>
+            </w:tcMar>
+            <w:vAlign w:val="center"/>
+          </w:tcPr>
+          <w:p>
+            <w:pPr>
+              <w:spacing w:after="0"/>
+            </w:pPr>
+            <w:r>
+              <w:rPr>
+                <w:sz w:val="17"/>
+              </w:rPr>
+              <w:t>Project with qno or Project; Taxonomy; Curriculum</w:t>
+            </w:r>
+          </w:p>
+        </w:tc>
+        <w:tc>
+          <w:tcPr>
+            <w:tcW w:type="dxa" w:w="3960"/>
+            <w:shd w:fill="EEF5FB"/>
+            <w:tcMar>
+              <w:top w:w="100" w:type="dxa"/>
+              <w:start w:w="110" w:type="dxa"/>
+              <w:bottom w:w="100" w:type="dxa"/>
+              <w:end w:w="110" w:type="dxa"/>
+            </w:tcMar>
+            <w:vAlign w:val="center"/>
+          </w:tcPr>
+          <w:p>
+            <w:pPr>
+              <w:spacing w:after="0"/>
+            </w:pPr>
+            <w:r>
+              <w:rPr>
+                <w:sz w:val="17"/>
+              </w:rPr>
+              <w:t>The app searches CMS and accepts only one exact question-name match before resolving the snippet ID.</w:t>
             </w:r>
           </w:p>
         </w:tc>
@@ -4484,6 +4605,38 @@
       <w:pPr>
         <w:spacing w:after="0"/>
       </w:pPr>
+    </w:p>
+    <w:p>
+      <w:pPr>
+        <w:pStyle w:val="ListBullet"/>
+      </w:pPr>
+      <w:r>
+        <w:t>Column order does not matter. Snippet id, Snippet IDs, Project and Project with qno are recognised heading variants.</w:t>
+      </w:r>
+    </w:p>
+    <w:p>
+      <w:pPr>
+        <w:pStyle w:val="ListBullet"/>
+      </w:pPr>
+      <w:r>
+        <w:t>Several Curriculum or Taxonomy paths may be placed on separate lines in the same spreadsheet cell.</w:t>
+      </w:r>
+    </w:p>
+    <w:p>
+      <w:pPr>
+        <w:pStyle w:val="ListBullet"/>
+      </w:pPr>
+      <w:r>
+        <w:t>Every row must provide at least one identifier: a positive Snippet ID or a Project with qno/Project value.</w:t>
+      </w:r>
+    </w:p>
+    <w:p>
+      <w:pPr>
+        <w:pStyle w:val="ListBullet"/>
+      </w:pPr>
+      <w:r>
+        <w:t>When both identifiers are supplied, the app confirms that the snippet’s exact CMS question name matches the Project value.</w:t>
+      </w:r>
     </w:p>
     <w:p>
       <w:pPr>
@@ -6076,11 +6229,6 @@
     <w:p>
       <w:r>
         <w:t>Rule is an internal category, not an error count. Rule 0 is therefore a valid general-processing category.</w:t>
-      </w:r>
-    </w:p>
-    <w:p>
-      <w:r>
-        <w:br w:type="page"/>
       </w:r>
     </w:p>
     <w:p>

</xml_diff>

<commit_message>
Match CMS mapping names case insensitively
</commit_message>
<xml_diff>
--- a/docs/CMS_DOCX_Processor_Team_Guide.docx
+++ b/docs/CMS_DOCX_Processor_Team_Guide.docx
@@ -4640,6 +4640,14 @@
     </w:p>
     <w:p>
       <w:pPr>
+        <w:pStyle w:val="ListBullet"/>
+      </w:pPr>
+      <w:r>
+        <w:t>Project names, spreadsheet headings and Curriculum/Taxonomy paths are matched without regard to uppercase or lowercase. Spelling and the hierarchy of path levels must still match.</w:t>
+      </w:r>
+    </w:p>
+    <w:p>
+      <w:pPr>
         <w:spacing w:before="60" w:after="120"/>
         <w:ind w:left="259" w:right="259"/>
         <w:shd w:fill="DDEBF7"/>

</xml_diff>

<commit_message>
Name images under plain question headings
</commit_message>
<xml_diff>
--- a/docs/CMS_DOCX_Processor_Team_Guide.docx
+++ b/docs/CMS_DOCX_Processor_Team_Guide.docx
@@ -15,7 +15,7 @@
         <w:pStyle w:val="Subtitle"/>
       </w:pPr>
       <w:r>
-        <w:t>Team authoring, processing and CMS mapping guide  |  Version 14.7  |  26 September 2026</w:t>
+        <w:t>Team authoring, processing and CMS mapping guide  |  Version 14.8  |  29 September 2026</w:t>
       </w:r>
     </w:p>
     <w:p>
@@ -4030,6 +4030,14 @@
     </w:p>
     <w:p>
       <w:pPr>
+        <w:pStyle w:val="ListBullet"/>
+      </w:pPr>
+      <w:r>
+        <w:t>Images and Alt Text processing recognises tagged headings and plain headings such as Question 16 Case study. In image-only work it keeps the document text unchanged, uses the detected question number in the filename and replaces stale Alt Text with the current CMS filename.</w:t>
+      </w:r>
+    </w:p>
+    <w:p>
+      <w:pPr>
         <w:pStyle w:val="Heading2"/>
         <w:keepNext/>
       </w:pPr>
@@ -7892,7 +7900,7 @@
               <w:rPr>
                 <w:sz w:val="17"/>
               </w:rPr>
-              <w:t>In Version 14.7, leave replacement clear and use positive New snippet id: or Snippet id: in every question. Wait for the latest Streamlit deployment if necessary.</w:t>
+              <w:t>In Version 14.8, leave replacement clear and use positive New snippet id: or Snippet id: in every question. Wait for the latest Streamlit deployment if necessary.</w:t>
             </w:r>
           </w:p>
         </w:tc>

</xml_diff>

<commit_message>
Clarify assertion reason formatting behavior
</commit_message>
<xml_diff>
--- a/docs/CMS_DOCX_Processor_Team_Guide.docx
+++ b/docs/CMS_DOCX_Processor_Team_Guide.docx
@@ -1366,7 +1366,7 @@
               <w:rPr>
                 <w:sz w:val="17"/>
               </w:rPr>
-              <w:t>Normalises spaces, operators, punctuation, rupee notation, whole-block bold, answers, subparts and Assertion–Reason structure.</w:t>
+              <w:t>Normalises spaces, operators, punctuation, rupee notation, whole-block bold, answers and subparts. For a clearly detected Assertion–Reason item, it can insert only the standard introductory sentence and reports incomplete choice structure.</w:t>
             </w:r>
           </w:p>
         </w:tc>
@@ -3433,7 +3433,15 @@
         <w:pStyle w:val="ListBullet"/>
       </w:pPr>
       <w:r>
-        <w:t>It preserves the author’s choice wording and requires four choices with exactly one correct answer.</w:t>
+        <w:t>This introductory sentence is the only Assertion–Reason structural content the app inserts automatically.</w:t>
+      </w:r>
+    </w:p>
+    <w:p>
+      <w:pPr>
+        <w:pStyle w:val="ListBullet"/>
+      </w:pPr>
+      <w:r>
+        <w:t>It preserves the author’s choice wording and checks for four choices with exactly one correct answer.</w:t>
       </w:r>
     </w:p>
     <w:p>

</xml_diff>

<commit_message>
Keep tables and multiline answers inside CMS sections
</commit_message>
<xml_diff>
--- a/docs/CMS_DOCX_Processor_Team_Guide.docx
+++ b/docs/CMS_DOCX_Processor_Team_Guide.docx
@@ -15,7 +15,7 @@
         <w:pStyle w:val="Subtitle"/>
       </w:pPr>
       <w:r>
-        <w:t>Team authoring, processing and CMS mapping guide  |  Version 14.8  |  29 September 2026</w:t>
+        <w:t>Team authoring, processing and CMS mapping guide  |  Version 14.9  |  15 October 2026</w:t>
       </w:r>
     </w:p>
     <w:p>
@@ -1677,7 +1677,7 @@
     </w:p>
     <w:p>
       <w:r>
-        <w:t>A clear FIB uses @Answers:@ in place of @Choices:@. The supplied answer is placed below @Answers:@ and each section receives its closing @e@ marker.</w:t>
+        <w:t>A clear FIB uses @Answers:@ in place of @Choices:@. The supplied answer is placed below @Answers:@ and each section receives its closing @e@ marker. If an FIB has labelled answers (a), (b), (c) and (d) in one Word paragraph with manual line breaks, Version 14.9 places them on separate lines inside the Answers block. Unlabelled or unclear multi-line answers are retained for review.</w:t>
       </w:r>
     </w:p>
     <w:p>
@@ -2268,7 +2268,7 @@
               <w:rPr>
                 <w:sz w:val="17"/>
               </w:rPr>
-              <w:t>Preserves table formatting. The app does not decide which rows or columns are headers; the author must bold genuine headers.</w:t>
+              <w:t>Preserves table formatting and places the Question block's closing @e@ after a trailing table. The app does not decide which rows or columns are headers; the author must bold genuine headers.</w:t>
             </w:r>
           </w:p>
         </w:tc>
@@ -7908,7 +7908,7 @@
               <w:rPr>
                 <w:sz w:val="17"/>
               </w:rPr>
-              <w:t>In Version 14.8, leave replacement clear and use positive New snippet id: or Snippet id: in every question. Wait for the latest Streamlit deployment if necessary.</w:t>
+              <w:t>In Version 14.9, leave replacement clear and use positive New snippet id: or Snippet id: in every question. Wait for the latest Streamlit deployment if necessary.</w:t>
             </w:r>
           </w:p>
         </w:tc>

</xml_diff>

<commit_message>
Harden DOCX structure and equation preservation
</commit_message>
<xml_diff>
--- a/docs/CMS_DOCX_Processor_Team_Guide.docx
+++ b/docs/CMS_DOCX_Processor_Team_Guide.docx
@@ -15,7 +15,7 @@
         <w:pStyle w:val="Subtitle"/>
       </w:pPr>
       <w:r>
-        <w:t>Team authoring, processing and CMS mapping guide  |  Version 14.9  |  15 October 2026</w:t>
+        <w:t>Team authoring, processing and CMS mapping guide  |  Version 14.12  |  17 October 2026</w:t>
       </w:r>
     </w:p>
     <w:p>
@@ -39,13 +39,7 @@
         <w:shd w:fill="DDEBF7"/>
       </w:pPr>
       <w:r>
-        <w:rPr>
-          <w:b/>
-        </w:rPr>
-        <w:t xml:space="preserve">Essential: </w:t>
-      </w:r>
-      <w:r>
-        <w:t>Use Enter after every displayed line. Do not use Shift+Enter to join metadata, choices or answers. Do not type @Question@, @Choices@, @Answers@, @Solution@ or @e@ tags in a new source document.</w:t>
+        <w:t>Recommended: Use Enter after every displayed line. The app tolerates some clear Shift+Enter structures, but ambiguous manual-line-break content is preserved and reported. Do not type @Question@, @Choices@, @Answers@, @Solution@ or @e@ tags in a new source document.</w:t>
       </w:r>
     </w:p>
     <w:p>
@@ -165,7 +159,7 @@
         <w:pStyle w:val="ListBullet"/>
       </w:pPr>
       <w:r>
-        <w:t>Keep the answer on the same line as Answer:. For several labelled answers, put each answer in a separate paragraph.</w:t>
+        <w:t>Keep a single answer on the same line as Answer:. For several labelled answers, use (a), (b), … or (i), (ii), … and preferably put each answer in a separate paragraph. Clear labelled answers separated with Shift+Enter are also recognised.</w:t>
       </w:r>
     </w:p>
     <w:p>
@@ -230,13 +224,7 @@
         <w:shd w:fill="DDEBF7"/>
       </w:pPr>
       <w:r>
-        <w:rPr>
-          <w:b/>
-        </w:rPr>
-        <w:t xml:space="preserve">Numbering rule: </w:t>
-      </w:r>
-      <w:r>
-        <w:t>Question numbers in the source must be unique, sequential and in ascending order. Duplicate, missing or out-of-order headings block the CMS-ready DOCX, images ZIP and mapping CSV until corrected.</w:t>
+        <w:t>Numbering rule: Question numbers in the source must be unique, sequential and in ascending order. Duplicate, missing or out-of-order headings block the CMS-ready DOCX, images ZIP and mapping CSV. Diagnostics distinguish a genuinely missing number, an unrecognised heading candidate, a heading embedded in a multiline paragraph, a duplicate and an out-of-order number, with paragraph positions where available.</w:t>
       </w:r>
     </w:p>
     <w:p>
@@ -1208,13 +1196,7 @@
             <w:vAlign w:val="center"/>
           </w:tcPr>
           <w:p>
-            <w:pPr>
-              <w:spacing w:after="0"/>
-            </w:pPr>
             <w:r>
-              <w:rPr>
-                <w:sz w:val="17"/>
-              </w:rPr>
               <w:t>Extracts images as GIFs, applies CMS filenames, writes filenames to Word Alt Text and reuses exact duplicates.</w:t>
             </w:r>
           </w:p>
@@ -1283,14 +1265,8 @@
             <w:vAlign w:val="center"/>
           </w:tcPr>
           <w:p>
-            <w:pPr>
-              <w:spacing w:after="0"/>
-            </w:pPr>
             <w:r>
-              <w:rPr>
-                <w:sz w:val="17"/>
-              </w:rPr>
-              <w:t>Preserves native equations; converts safe fractions and radicals; removes blank equation templates; applies conservative variable/geometry italics.</w:t>
+              <w:t>Preserves every non-empty native equation and verifies its text and structural operators; removes only genuinely blank standalone equation objects; converts safe fractions and radicals; applies conservative variable/geometry italics.</w:t>
             </w:r>
           </w:p>
         </w:tc>
@@ -1677,7 +1653,7 @@
     </w:p>
     <w:p>
       <w:r>
-        <w:t>A clear FIB uses @Answers:@ in place of @Choices:@. The supplied answer is placed below @Answers:@ and each section receives its closing @e@ marker. If an FIB has labelled answers (a), (b), (c) and (d) in one Word paragraph with manual line breaks, Version 14.9 places them on separate lines inside the Answers block. Unlabelled or unclear multi-line answers are retained for review.</w:t>
+        <w:t>A clear FIB uses @Answers:@ in place of @Choices:@. The supplied answer is placed below @Answers:@ and each section receives its closing @e@ marker. Labelled answers may use (a), (b), … or (i), (ii), … and may be separated by paragraph breaks or manual line breaks. The app moves only an unambiguous labelled block; an unclear answer boundary is preserved and reported.</w:t>
       </w:r>
     </w:p>
     <w:p>
@@ -1751,7 +1727,7 @@
         <w:pStyle w:val="ListBullet"/>
       </w:pPr>
       <w:r>
-        <w:t>Accepted plain headings include Question 1, Question: 1, Q1 and Question 44: Easy, Comprehension.</w:t>
+        <w:t>Accepted plain headings include Question 1, Question: 1, Question 1:, Q1, Q. 1, Question 20, Case study, Question 20 – Case study, Question 37, Assertion Reasoning and Question 44: Easy, Comprehension. Capitalisation and harmless spaces may vary.</w:t>
       </w:r>
     </w:p>
     <w:p>
@@ -1767,7 +1743,7 @@
         <w:pStyle w:val="ListBullet"/>
       </w:pPr>
       <w:r>
-        <w:t>A same-line note such as Case study is retained as @Question: 10@ Case study.</w:t>
+        <w:t>A same-line descriptive suffix such as Case study or Assertion–Reasoning is retained after the generated tag, for example @Question: 10@ Case study. Harmless punctuation around the number is normalised.</w:t>
       </w:r>
     </w:p>
     <w:p>
@@ -1775,7 +1751,7 @@
         <w:pStyle w:val="ListBullet"/>
       </w:pPr>
       <w:r>
-        <w:t>Do not place an unrelated heading between questions unless it is meant to belong to the preceding question. Review unsectioned text reported by the app.</w:t>
+        <w:t>A heading and following metadata joined with Shift+Enter are separated only when the paragraph has a clear supported structure. The same conservative handling applies to metadata, labelled FIB answers and compound MCQ choices. Paragraphs containing equations, images or unclear structural boundaries are not rebuilt as plain text; ambiguous cases are preserved and reported. Ordinary references such as ‘Refer to Question 20’ and ‘In Question 15’ are not treated as new headings. Do not place an unrelated heading between questions unless it belongs to the preceding question.</w:t>
       </w:r>
     </w:p>
     <w:p>
@@ -3260,14 +3236,8 @@
             <w:vAlign w:val="center"/>
           </w:tcPr>
           <w:p>
-            <w:pPr>
-              <w:spacing w:after="0"/>
-            </w:pPr>
             <w:r>
-              <w:rPr>
-                <w:sz w:val="17"/>
-              </w:rPr>
-              <w:t>Removes the empty template.</w:t>
+              <w:t>Removes a genuinely empty standalone equation object. An empty script slot embedded in a non-empty equation is preserved.</w:t>
             </w:r>
           </w:p>
         </w:tc>
@@ -3284,14 +3254,8 @@
             <w:vAlign w:val="center"/>
           </w:tcPr>
           <w:p>
-            <w:pPr>
-              <w:spacing w:after="0"/>
-            </w:pPr>
             <w:r>
-              <w:rPr>
-                <w:sz w:val="17"/>
-              </w:rPr>
-              <w:t>It has no mathematical content and can produce artifacts such as ^{}.</w:t>
+              <w:t>Embedded script structures belong to the author-created equation and are kept even when a slot is visually blank.</w:t>
             </w:r>
           </w:p>
         </w:tc>
@@ -6244,6 +6208,50 @@
           </w:p>
         </w:tc>
       </w:tr>
+      <w:tr>
+        <w:tc>
+          <w:tcPr>
+            <w:tcW w:type="dxa" w:w="5083"/>
+          </w:tcPr>
+          <w:p>
+            <w:r>
+              <w:t>17</w:t>
+            </w:r>
+          </w:p>
+        </w:tc>
+        <w:tc>
+          <w:tcPr>
+            <w:tcW w:type="dxa" w:w="5083"/>
+          </w:tcPr>
+          <w:p>
+            <w:r>
+              <w:t>Manual line-break structure that cannot be separated safely</w:t>
+            </w:r>
+          </w:p>
+        </w:tc>
+      </w:tr>
+      <w:tr>
+        <w:tc>
+          <w:tcPr>
+            <w:tcW w:type="dxa" w:w="5083"/>
+          </w:tcPr>
+          <w:p>
+            <w:r>
+              <w:t>18</w:t>
+            </w:r>
+          </w:p>
+        </w:tc>
+        <w:tc>
+          <w:tcPr>
+            <w:tcW w:type="dxa" w:w="5083"/>
+          </w:tcPr>
+          <w:p>
+            <w:r>
+              <w:t>Unrecognised or ambiguous Answer/Answers boundary</w:t>
+            </w:r>
+          </w:p>
+        </w:tc>
+      </w:tr>
     </w:tbl>
     <w:p>
       <w:pPr>
@@ -6961,6 +6969,102 @@
                 <w:sz w:val="17"/>
               </w:rPr>
               <w:t>Place the text under the correct question section.</w:t>
+            </w:r>
+          </w:p>
+        </w:tc>
+      </w:tr>
+      <w:tr>
+        <w:tc>
+          <w:tcPr>
+            <w:tcW w:type="dxa" w:w="3389"/>
+          </w:tcPr>
+          <w:p>
+            <w:r>
+              <w:t>Ambiguous manual-line-break structure</w:t>
+            </w:r>
+          </w:p>
+        </w:tc>
+        <w:tc>
+          <w:tcPr>
+            <w:tcW w:type="dxa" w:w="3389"/>
+          </w:tcPr>
+          <w:p>
+            <w:r>
+              <w:t>Splitting the paragraph could move an equation, image or content into the wrong CMS section.</w:t>
+            </w:r>
+          </w:p>
+        </w:tc>
+        <w:tc>
+          <w:tcPr>
+            <w:tcW w:type="dxa" w:w="3389"/>
+          </w:tcPr>
+          <w:p>
+            <w:r>
+              <w:t>Replace the relevant Shift+Enter with Enter and process again.</w:t>
+            </w:r>
+          </w:p>
+        </w:tc>
+      </w:tr>
+      <w:tr>
+        <w:tc>
+          <w:tcPr>
+            <w:tcW w:type="dxa" w:w="3389"/>
+          </w:tcPr>
+          <w:p>
+            <w:r>
+              <w:t>Unrecognised Answer/Answers boundary</w:t>
+            </w:r>
+          </w:p>
+        </w:tc>
+        <w:tc>
+          <w:tcPr>
+            <w:tcW w:type="dxa" w:w="3389"/>
+          </w:tcPr>
+          <w:p>
+            <w:r>
+              <w:t>The following lines do not prove where the question ends and the answer block begins.</w:t>
+            </w:r>
+          </w:p>
+        </w:tc>
+        <w:tc>
+          <w:tcPr>
+            <w:tcW w:type="dxa" w:w="3389"/>
+          </w:tcPr>
+          <w:p>
+            <w:r>
+              <w:t>Use Answer: or Answers: followed by clearly labelled answer lines.</w:t>
+            </w:r>
+          </w:p>
+        </w:tc>
+      </w:tr>
+      <w:tr>
+        <w:tc>
+          <w:tcPr>
+            <w:tcW w:type="dxa" w:w="3389"/>
+          </w:tcPr>
+          <w:p>
+            <w:r>
+              <w:t>Original Word equation changed</w:t>
+            </w:r>
+          </w:p>
+        </w:tc>
+        <w:tc>
+          <w:tcPr>
+            <w:tcW w:type="dxa" w:w="3389"/>
+          </w:tcPr>
+          <w:p>
+            <w:r>
+              <w:t>A non-empty source equation lost or changed mathematical text or a structural operator.</w:t>
+            </w:r>
+          </w:p>
+        </w:tc>
+        <w:tc>
+          <w:tcPr>
+            <w:tcW w:type="dxa" w:w="3389"/>
+          </w:tcPr>
+          <w:p>
+            <w:r>
+              <w:t>Use the reported question, paragraph and equation number to inspect the source; no processed document is released.</w:t>
             </w:r>
           </w:p>
         </w:tc>
@@ -7901,14 +8005,8 @@
             <w:vAlign w:val="center"/>
           </w:tcPr>
           <w:p>
-            <w:pPr>
-              <w:spacing w:after="0"/>
-            </w:pPr>
             <w:r>
-              <w:rPr>
-                <w:sz w:val="17"/>
-              </w:rPr>
-              <w:t>In Version 14.9, leave replacement clear and use positive New snippet id: or Snippet id: in every question. Wait for the latest Streamlit deployment if necessary.</w:t>
+              <w:t>In Version 14.12, leave replacement clear and use positive New snippet id: or Snippet id: in every question. Wait for the latest Streamlit deployment if necessary.</w:t>
             </w:r>
           </w:p>
         </w:tc>
@@ -7954,14 +8052,8 @@
             <w:vAlign w:val="center"/>
           </w:tcPr>
           <w:p>
-            <w:pPr>
-              <w:spacing w:after="0"/>
-            </w:pPr>
             <w:r>
-              <w:rPr>
-                <w:sz w:val="17"/>
-              </w:rPr>
-              <w:t>A question heading does not match a supported standalone format or numbering is malformed.</w:t>
+              <w:t>A heading is malformed, placed within an unsupported multiline structure or resembles ordinary question text.</w:t>
             </w:r>
           </w:p>
         </w:tc>
@@ -7978,14 +8070,8 @@
             <w:vAlign w:val="center"/>
           </w:tcPr>
           <w:p>
-            <w:pPr>
-              <w:spacing w:after="0"/>
-            </w:pPr>
             <w:r>
-              <w:rPr>
-                <w:sz w:val="17"/>
-              </w:rPr>
-              <w:t>Use Question n on its own line; same-line notes after n are allowed.</w:t>
+              <w:t>Read the numbering diagnostic. It identifies a missing number, unrecognised heading candidate or multiline heading and gives a paragraph position where available.</w:t>
             </w:r>
           </w:p>
         </w:tc>
@@ -8513,6 +8599,38 @@
                 <w:sz w:val="17"/>
               </w:rPr>
               <w:t>Clear sections 3 and/or 4 when those changes are not wanted.</w:t>
+            </w:r>
+          </w:p>
+        </w:tc>
+      </w:tr>
+      <w:tr>
+        <w:tc>
+          <w:tcPr>
+            <w:tcW w:type="dxa" w:w="3389"/>
+          </w:tcPr>
+          <w:p>
+            <w:r>
+              <w:t>Processing stops because an original equation changed</w:t>
+            </w:r>
+          </w:p>
+        </w:tc>
+        <w:tc>
+          <w:tcPr>
+            <w:tcW w:type="dxa" w:w="3389"/>
+          </w:tcPr>
+          <w:p>
+            <w:r>
+              <w:t>The equation-integrity check found missing/changed mathematical text or a changed structural operator.</w:t>
+            </w:r>
+          </w:p>
+        </w:tc>
+        <w:tc>
+          <w:tcPr>
+            <w:tcW w:type="dxa" w:w="3389"/>
+          </w:tcPr>
+          <w:p>
+            <w:r>
+              <w:t>Inspect the reported question, paragraph and equation number. The safeguard is not bypassed and no processed DOCX is released.</w:t>
             </w:r>
           </w:p>
         </w:tc>

</xml_diff>

<commit_message>
Update team guide for version 14.16
</commit_message>
<xml_diff>
--- a/docs/CMS_DOCX_Processor_Team_Guide.docx
+++ b/docs/CMS_DOCX_Processor_Team_Guide.docx
@@ -15,7 +15,7 @@
         <w:pStyle w:val="Subtitle"/>
       </w:pPr>
       <w:r>
-        <w:t>Team authoring, processing and CMS mapping guide  |  Version 14.12  |  17 October 2026</w:t>
+        <w:t>Team authoring, processing and CMS mapping guide  |  Version 14.16  |  22 October 2026</w:t>
       </w:r>
     </w:p>
     <w:p>
@@ -91,7 +91,7 @@
         <w:pStyle w:val="ListBullet"/>
       </w:pPr>
       <w:r>
-        <w:t>Use exactly four choices, labelled a) to d), with one choice in each Word paragraph.</w:t>
+        <w:t>Use exactly four choices with one choice in each Word paragraph. Labels may be typed as a) to d) or applied as one four-item Word alphabetic list. The app converts a clear automatic a–d list to @1@–@4@ and removes its hidden list formatting.</w:t>
       </w:r>
     </w:p>
     <w:p>
@@ -1678,6 +1678,22 @@
         <w:pStyle w:val="ListBullet"/>
       </w:pPr>
       <w:r>
+        <w:t>A Word-generated alphabetic list is accepted only when the question is explicitly MCQ and exactly four consecutive choices resolve unambiguously to a), b), c) and d). Other numbered lists are preserved for review.</w:t>
+      </w:r>
+    </w:p>
+    <w:p>
+      <w:pPr>
+        <w:pStyle w:val="ListBullet"/>
+      </w:pPr>
+      <w:r>
+        <w:t>When automatic list labels are converted, the app removes both the numbering property and its residual hanging indentation so Anand’s tool receives four independent CMS choice paragraphs.</w:t>
+      </w:r>
+    </w:p>
+    <w:p>
+      <w:pPr>
+        <w:pStyle w:val="ListBullet"/>
+      </w:pPr>
+      <w:r>
         <w:t>A clear single answer without choices is structured as an FIB.</w:t>
       </w:r>
     </w:p>
@@ -1695,6 +1711,14 @@
       </w:pPr>
       <w:r>
         <w:t>Both Choices and Answers in one record, incomplete choices, conflicting answer labels/text or multiple answer markers are preserved and reported for review.</w:t>
+      </w:r>
+    </w:p>
+    <w:p>
+      <w:pPr>
+        <w:pStyle w:val="ListBullet"/>
+      </w:pPr>
+      <w:r>
+        <w:t>An explicit FIB declaration is respected before MCQ answer-key interpretation. An answer beginning with a mathematical variable such as A, B, x or y is not treated as an MCQ key unless four clear choices are present.</w:t>
       </w:r>
     </w:p>
     <w:p>
@@ -1872,14 +1896,8 @@
             <w:vAlign w:val="center"/>
           </w:tcPr>
           <w:p>
-            <w:pPr>
-              <w:spacing w:after="0"/>
-            </w:pPr>
             <w:r>
-              <w:rPr>
-                <w:sz w:val="17"/>
-              </w:rPr>
-              <w:t>Replaces non-breaking spaces, collapses repeated spaces across adjacent runs, retains one space at prose/math boundaries and removes spaces before punctuation.</w:t>
+              <w:t>Replaces non-breaking spaces and normalises repeated prose spacing across adjacent runs. Spacing around numeric comma-separated content is preserved exactly as authored.</w:t>
             </w:r>
           </w:p>
         </w:tc>
@@ -1925,14 +1943,8 @@
             <w:vAlign w:val="center"/>
           </w:tcPr>
           <w:p>
-            <w:pPr>
-              <w:spacing w:after="0"/>
-            </w:pPr>
             <w:r>
-              <w:rPr>
-                <w:sz w:val="17"/>
-              </w:rPr>
-              <w:t>Normalises spaces before and after =, +, −, × and ÷ when text normalisation is selected.</w:t>
+              <w:t>Normalises binary operators when text normalisation is selected, while distinguishing unary signs: (−6) remains compact and p−q becomes p − q.</w:t>
             </w:r>
           </w:p>
         </w:tc>
@@ -1976,14 +1988,8 @@
             <w:vAlign w:val="center"/>
           </w:tcPr>
           <w:p>
-            <w:pPr>
-              <w:spacing w:after="0"/>
-            </w:pPr>
             <w:r>
-              <w:rPr>
-                <w:sz w:val="17"/>
-              </w:rPr>
-              <w:t>Ensures a space after commas where appropriate.</w:t>
+              <w:t>Normalises prose comma spacing but does not infer thousands separators or alter spacing in numeric sequences: 1,250; 1, 250; and −15, 28 remain as authored.</w:t>
             </w:r>
           </w:p>
         </w:tc>
@@ -2245,6 +2251,100 @@
                 <w:sz w:val="17"/>
               </w:rPr>
               <w:t>Preserves table formatting and places the Question block's closing @e@ after a trailing table. The app does not decide which rows or columns are headers; the author must bold genuine headers.</w:t>
+            </w:r>
+          </w:p>
+        </w:tc>
+      </w:tr>
+      <w:tr>
+        <w:trPr>
+          <w:cantSplit w:val="true"/>
+        </w:trPr>
+        <w:tc>
+          <w:tcPr>
+            <w:tcW w:type="dxa" w:w="1656"/>
+            <w:shd w:fill="EEF5FB"/>
+            <w:tcMar>
+              <w:top w:w="100" w:type="dxa"/>
+              <w:start w:w="110" w:type="dxa"/>
+              <w:bottom w:w="100" w:type="dxa"/>
+              <w:end w:w="110" w:type="dxa"/>
+            </w:tcMar>
+            <w:vAlign w:val="center"/>
+          </w:tcPr>
+          <w:p>
+            <w:pPr>
+              <w:keepLines/>
+            </w:pPr>
+            <w:r>
+              <w:t>Automatic MCQ lists</w:t>
+            </w:r>
+          </w:p>
+        </w:tc>
+        <w:tc>
+          <w:tcPr>
+            <w:tcW w:type="dxa" w:w="8712"/>
+            <w:shd w:fill="EEF5FB"/>
+            <w:tcMar>
+              <w:top w:w="100" w:type="dxa"/>
+              <w:start w:w="110" w:type="dxa"/>
+              <w:bottom w:w="100" w:type="dxa"/>
+              <w:end w:w="110" w:type="dxa"/>
+            </w:tcMar>
+            <w:vAlign w:val="center"/>
+          </w:tcPr>
+          <w:p>
+            <w:pPr>
+              <w:keepLines/>
+            </w:pPr>
+            <w:r>
+              <w:t>Recognises only a clear four-item Word alphabetic list in an explicit MCQ, converts it to @1@–@4@ and removes list numbering plus hanging indentation.</w:t>
+            </w:r>
+          </w:p>
+        </w:tc>
+      </w:tr>
+      <w:tr>
+        <w:trPr>
+          <w:cantSplit w:val="true"/>
+        </w:trPr>
+        <w:tc>
+          <w:tcPr>
+            <w:tcW w:type="dxa" w:w="1656"/>
+            <w:shd w:fill="EEF5FB"/>
+            <w:tcMar>
+              <w:top w:w="100" w:type="dxa"/>
+              <w:start w:w="110" w:type="dxa"/>
+              <w:bottom w:w="100" w:type="dxa"/>
+              <w:end w:w="110" w:type="dxa"/>
+            </w:tcMar>
+            <w:vAlign w:val="center"/>
+          </w:tcPr>
+          <w:p>
+            <w:pPr>
+              <w:keepLines/>
+            </w:pPr>
+            <w:r>
+              <w:t>Part labels</w:t>
+            </w:r>
+          </w:p>
+        </w:tc>
+        <w:tc>
+          <w:tcPr>
+            <w:tcW w:type="dxa" w:w="8712"/>
+            <w:shd w:fill="EEF5FB"/>
+            <w:tcMar>
+              <w:top w:w="100" w:type="dxa"/>
+              <w:start w:w="110" w:type="dxa"/>
+              <w:bottom w:w="100" w:type="dxa"/>
+              <w:end w:w="110" w:type="dxa"/>
+            </w:tcMar>
+            <w:vAlign w:val="center"/>
+          </w:tcPr>
+          <w:p>
+            <w:pPr>
+              <w:keepLines/>
+            </w:pPr>
+            <w:r>
+              <w:t>Keeps alphabetic labels (a)–(e) and paragraph-start Roman labels such as (i), (ii) and (iii) upright while still italicising clear mathematical variables.</w:t>
             </w:r>
           </w:p>
         </w:tc>
@@ -3304,7 +3404,7 @@
         <w:pStyle w:val="ListBullet"/>
       </w:pPr>
       <w:r>
-        <w:t>Ordinary articles and labels are protected: A circle, Option A, Assertion (A), Reason (R), part (a) and choice a) are not treated as variables.</w:t>
+        <w:t>Ordinary articles and labels are protected: A circle, Option A, Assertion (A), Reason (R), part (a), choice a) and paragraph-start Roman labels such as (i), (ii) and (iii) are not treated as variables.</w:t>
       </w:r>
     </w:p>
     <w:p>
@@ -3348,7 +3448,7 @@
     </w:p>
     <w:p>
       <w:r>
-        <w:t>Use the following plain authoring structure. Assertion labels A and R remain upright unless the author deliberately formats them otherwise.</w:t>
+        <w:t>Use the following authoring structure. Bold only the two labels that introduce the statements: Assertion (A) and Reason (R). Their later occurrences in the introductory sentence and choices remain regular text. The label letters A and R remain upright.</w:t>
       </w:r>
     </w:p>
     <w:p>
@@ -3358,29 +3458,89 @@
       </w:pPr>
       <w:r>
         <w:t>Question 3</w:t>
+      </w:r>
+      <w:r>
         <w:br/>
+      </w:r>
+      <w:r>
         <w:t>Difficulty level: Average</w:t>
+      </w:r>
+      <w:r>
         <w:br/>
+      </w:r>
+      <w:r>
         <w:t>Objective: Analysis</w:t>
+      </w:r>
+      <w:r>
         <w:br/>
+      </w:r>
+      <w:r>
         <w:t>Question type: MCQ</w:t>
+      </w:r>
+      <w:r>
         <w:br/>
+      </w:r>
+      <w:r>
         <w:t>A statement of Assertion (A) is followed by a statement of Reason (R).</w:t>
+      </w:r>
+      <w:r>
         <w:br/>
-        <w:t>Assertion (A): A is a factor of B.</w:t>
+      </w:r>
+      <w:r>
+        <w:rPr>
+          <w:b/>
+        </w:rPr>
+        <w:t>Assertion (A)</w:t>
+      </w:r>
+      <w:r>
+        <w:t>: A is a factor of B.</w:t>
+      </w:r>
+      <w:r>
         <w:br/>
-        <w:t>Reason (R): All prime factors of A occur in B with at least the same powers.</w:t>
+      </w:r>
+      <w:r>
+        <w:rPr>
+          <w:b/>
+        </w:rPr>
+        <w:t>Reason (R)</w:t>
+      </w:r>
+      <w:r>
+        <w:t>: All prime factors of A occur in B with at least the same powers.</w:t>
+      </w:r>
+      <w:r>
         <w:br/>
+      </w:r>
+      <w:r>
         <w:t>Choose the correct option:</w:t>
+      </w:r>
+      <w:r>
         <w:br/>
+      </w:r>
+      <w:r>
         <w:t>a) Both Assertion (A) and Reason (R) are true and Reason (R) is the correct explanation of Assertion (A)</w:t>
+      </w:r>
+      <w:r>
         <w:br/>
+      </w:r>
+      <w:r>
         <w:t>b) Both Assertion (A) and Reason (R) are true and Reason (R) is not the correct explanation of Assertion (A)</w:t>
+      </w:r>
+      <w:r>
         <w:br/>
+      </w:r>
+      <w:r>
         <w:t>c) Assertion (A) is true but Reason (R) is false</w:t>
+      </w:r>
+      <w:r>
         <w:br/>
+      </w:r>
+      <w:r>
         <w:t>d) Assertion (A) is false but Reason (R) is true</w:t>
+      </w:r>
+      <w:r>
         <w:br/>
+      </w:r>
+      <w:r>
         <w:t>Answer: a</w:t>
       </w:r>
     </w:p>
@@ -7790,6 +7950,142 @@
           </w:p>
         </w:tc>
       </w:tr>
+      <w:tr>
+        <w:trPr>
+          <w:cantSplit w:val="true"/>
+        </w:trPr>
+        <w:tc>
+          <w:tcPr>
+            <w:tcW w:type="dxa" w:w="2952"/>
+            <w:shd w:fill="EEF5FB"/>
+            <w:tcMar>
+              <w:top w:w="100" w:type="dxa"/>
+              <w:start w:w="110" w:type="dxa"/>
+              <w:bottom w:w="100" w:type="dxa"/>
+              <w:end w:w="110" w:type="dxa"/>
+            </w:tcMar>
+            <w:vAlign w:val="center"/>
+          </w:tcPr>
+          <w:p>
+            <w:pPr>
+              <w:keepLines/>
+            </w:pPr>
+            <w:r>
+              <w:t>Leaving Word-list indentation after converting a)–d) choices</w:t>
+            </w:r>
+          </w:p>
+        </w:tc>
+        <w:tc>
+          <w:tcPr>
+            <w:tcW w:type="dxa" w:w="4104"/>
+            <w:shd w:fill="EEF5FB"/>
+            <w:tcMar>
+              <w:top w:w="100" w:type="dxa"/>
+              <w:start w:w="110" w:type="dxa"/>
+              <w:bottom w:w="100" w:type="dxa"/>
+              <w:end w:w="110" w:type="dxa"/>
+            </w:tcMar>
+            <w:vAlign w:val="center"/>
+          </w:tcPr>
+          <w:p>
+            <w:pPr>
+              <w:keepLines/>
+            </w:pPr>
+            <w:r>
+              <w:t>The app removes automatic numbering and the associated hanging indent when it writes @1@–@4@.</w:t>
+            </w:r>
+          </w:p>
+        </w:tc>
+        <w:tc>
+          <w:tcPr>
+            <w:tcW w:type="dxa" w:w="3312"/>
+            <w:shd w:fill="EEF5FB"/>
+            <w:tcMar>
+              <w:top w:w="100" w:type="dxa"/>
+              <w:start w:w="110" w:type="dxa"/>
+              <w:bottom w:w="100" w:type="dxa"/>
+              <w:end w:w="110" w:type="dxa"/>
+            </w:tcMar>
+            <w:vAlign w:val="center"/>
+          </w:tcPr>
+          <w:p>
+            <w:pPr>
+              <w:keepLines/>
+            </w:pPr>
+            <w:r>
+              <w:t>Residual list formatting caused some downstream DOCX readers, including Anand’s tool, to group four separate choices as one logical block.</w:t>
+            </w:r>
+          </w:p>
+        </w:tc>
+      </w:tr>
+      <w:tr>
+        <w:trPr>
+          <w:cantSplit w:val="true"/>
+        </w:trPr>
+        <w:tc>
+          <w:tcPr>
+            <w:tcW w:type="dxa" w:w="2952"/>
+            <w:shd w:fill="EEF5FB"/>
+            <w:tcMar>
+              <w:top w:w="100" w:type="dxa"/>
+              <w:start w:w="110" w:type="dxa"/>
+              <w:bottom w:w="100" w:type="dxa"/>
+              <w:end w:w="110" w:type="dxa"/>
+            </w:tcMar>
+            <w:vAlign w:val="center"/>
+          </w:tcPr>
+          <w:p>
+            <w:pPr>
+              <w:keepLines/>
+            </w:pPr>
+            <w:r>
+              <w:t>Treating any Answer beginning with A–D as an MCQ key</w:t>
+            </w:r>
+          </w:p>
+        </w:tc>
+        <w:tc>
+          <w:tcPr>
+            <w:tcW w:type="dxa" w:w="4104"/>
+            <w:shd w:fill="EEF5FB"/>
+            <w:tcMar>
+              <w:top w:w="100" w:type="dxa"/>
+              <w:start w:w="110" w:type="dxa"/>
+              <w:bottom w:w="100" w:type="dxa"/>
+              <w:end w:w="110" w:type="dxa"/>
+            </w:tcMar>
+            <w:vAlign w:val="center"/>
+          </w:tcPr>
+          <w:p>
+            <w:pPr>
+              <w:keepLines/>
+            </w:pPr>
+            <w:r>
+              <w:t>An explicit FIB is respected and four clear MCQ choices are required before choice-text validation.</w:t>
+            </w:r>
+          </w:p>
+        </w:tc>
+        <w:tc>
+          <w:tcPr>
+            <w:tcW w:type="dxa" w:w="3312"/>
+            <w:shd w:fill="EEF5FB"/>
+            <w:tcMar>
+              <w:top w:w="100" w:type="dxa"/>
+              <w:start w:w="110" w:type="dxa"/>
+              <w:bottom w:w="100" w:type="dxa"/>
+              <w:end w:w="110" w:type="dxa"/>
+            </w:tcMar>
+            <w:vAlign w:val="center"/>
+          </w:tcPr>
+          <w:p>
+            <w:pPr>
+              <w:keepLines/>
+            </w:pPr>
+            <w:r>
+              <w:t>Mathematical answers such as A = 35° must remain FIB answers.</w:t>
+            </w:r>
+          </w:p>
+        </w:tc>
+      </w:tr>
     </w:tbl>
     <w:p>
       <w:pPr>
@@ -8006,7 +8302,7 @@
           </w:tcPr>
           <w:p>
             <w:r>
-              <w:t>In Version 14.12, leave replacement clear and use positive New snippet id: or Snippet id: in every question. Wait for the latest Streamlit deployment if necessary.</w:t>
+              <w:t>Leave replacement clear and use a positive New snippet id: or Snippet id: in every question. Select replacement only when IDs must be regenerated; then enter a positive First snippet ID.</w:t>
             </w:r>
           </w:p>
         </w:tc>
@@ -8635,6 +8931,88 @@
           </w:p>
         </w:tc>
       </w:tr>
+      <w:tr>
+        <w:tc>
+          <w:tcPr>
+            <w:tcW w:type="dxa" w:w="3389"/>
+          </w:tcPr>
+          <w:p>
+            <w:pPr>
+              <w:keepLines/>
+            </w:pPr>
+            <w:r>
+              <w:t>Anand’s tool reports Shift+Enter merged choices although Word shows separate lines</w:t>
+            </w:r>
+          </w:p>
+        </w:tc>
+        <w:tc>
+          <w:tcPr>
+            <w:tcW w:type="dxa" w:w="3389"/>
+          </w:tcPr>
+          <w:p>
+            <w:pPr>
+              <w:keepLines/>
+            </w:pPr>
+            <w:r>
+              <w:t>The choices came from Word automatic numbering and retained hidden hanging indentation after the visible labels changed.</w:t>
+            </w:r>
+          </w:p>
+        </w:tc>
+        <w:tc>
+          <w:tcPr>
+            <w:tcW w:type="dxa" w:w="3389"/>
+          </w:tcPr>
+          <w:p>
+            <w:pPr>
+              <w:keepLines/>
+            </w:pPr>
+            <w:r>
+              <w:t>Process with Version 14.16 or later. For a manual repair, select the four choices, turn Numbering off, set Left indentation to 0 and Special to None, and confirm that each line ends with ¶ rather than ↵.</w:t>
+            </w:r>
+          </w:p>
+        </w:tc>
+      </w:tr>
+      <w:tr>
+        <w:tc>
+          <w:tcPr>
+            <w:tcW w:type="dxa" w:w="3389"/>
+          </w:tcPr>
+          <w:p>
+            <w:pPr>
+              <w:keepLines/>
+            </w:pPr>
+            <w:r>
+              <w:t>Only (i) became italic while (ii) and (iii) remained upright</w:t>
+            </w:r>
+          </w:p>
+        </w:tc>
+        <w:tc>
+          <w:tcPr>
+            <w:tcW w:type="dxa" w:w="3389"/>
+          </w:tcPr>
+          <w:p>
+            <w:pPr>
+              <w:keepLines/>
+            </w:pPr>
+            <w:r>
+              <w:t>An older build interpreted the single letter i beside brackets as a variable.</w:t>
+            </w:r>
+          </w:p>
+        </w:tc>
+        <w:tc>
+          <w:tcPr>
+            <w:tcW w:type="dxa" w:w="3389"/>
+          </w:tcPr>
+          <w:p>
+            <w:pPr>
+              <w:keepLines/>
+            </w:pPr>
+            <w:r>
+              <w:t>Process with Version 14.16 or later. Paragraph-start Roman subpart and answer labels remain upright.</w:t>
+            </w:r>
+          </w:p>
+        </w:tc>
+      </w:tr>
     </w:tbl>
     <w:p>
       <w:pPr>
@@ -8689,6 +9067,14 @@
       </w:pPr>
       <w:r>
         <w:t>☐ Four MCQ choices and one matching answer key are present.</w:t>
+      </w:r>
+    </w:p>
+    <w:p>
+      <w:pPr>
+        <w:pStyle w:val="ListBullet"/>
+      </w:pPr>
+      <w:r>
+        <w:t>☐ Each MCQ choice ends with Enter. If Word automatic numbering is used, it is one clear a)–d) list.</w:t>
       </w:r>
     </w:p>
     <w:p>
@@ -8811,6 +9197,14 @@
       </w:pPr>
       <w:r>
         <w:t>☐ Anand’s tool created the CMS snippets before mapping was attempted.</w:t>
+      </w:r>
+    </w:p>
+    <w:p>
+      <w:pPr>
+        <w:pStyle w:val="ListBullet"/>
+      </w:pPr>
+      <w:r>
+        <w:t>☐ Anand’s tool recognises each @1@–@4@ choice as a separate paragraph; no merged-choice alert remains.</w:t>
       </w:r>
     </w:p>
     <w:p>

</xml_diff>